<commit_message>
Actualizacion semanal automatica 2026-05-22
</commit_message>
<xml_diff>
--- a/Acervo_Jurisprudencial.docx
+++ b/Acervo_Jurisprudencial.docx
@@ -627,7 +627,7 @@
           <w:color w:val="555555"/>
           <w:sz w:val="20"/>
         </w:rPr>
-        <w:t xml:space="preserve">  (4)</w:t>
+        <w:t xml:space="preserve">  (5)</w:t>
       </w:r>
     </w:p>
     <w:p>
@@ -684,7 +684,7 @@
           <w:color w:val="555555"/>
           <w:sz w:val="18"/>
         </w:rPr>
-        <w:t xml:space="preserve">  [1]</w:t>
+        <w:t xml:space="preserve">  [2]</w:t>
       </w:r>
     </w:p>
     <w:p>
@@ -1235,7 +1235,7 @@
           <w:color w:val="555555"/>
           <w:sz w:val="20"/>
         </w:rPr>
-        <w:t xml:space="preserve">  (6)</w:t>
+        <w:t xml:space="preserve">  (7)</w:t>
       </w:r>
     </w:p>
     <w:p>
@@ -1311,7 +1311,7 @@
           <w:color w:val="555555"/>
           <w:sz w:val="18"/>
         </w:rPr>
-        <w:t xml:space="preserve">  [1]</w:t>
+        <w:t xml:space="preserve">  [2]</w:t>
       </w:r>
     </w:p>
     <w:p>
@@ -1409,7 +1409,7 @@
           <w:color w:val="555555"/>
           <w:sz w:val="20"/>
         </w:rPr>
-        <w:t xml:space="preserve">  (4)</w:t>
+        <w:t xml:space="preserve">  (5)</w:t>
       </w:r>
     </w:p>
     <w:p>
@@ -1447,7 +1447,7 @@
           <w:color w:val="555555"/>
           <w:sz w:val="18"/>
         </w:rPr>
-        <w:t xml:space="preserve">  [3]</w:t>
+        <w:t xml:space="preserve">  [4]</w:t>
       </w:r>
     </w:p>
     <w:p>
@@ -1523,7 +1523,7 @@
           <w:color w:val="555555"/>
           <w:sz w:val="20"/>
         </w:rPr>
-        <w:t xml:space="preserve">  (14)</w:t>
+        <w:t xml:space="preserve">  (15)</w:t>
       </w:r>
     </w:p>
     <w:p>
@@ -1618,7 +1618,7 @@
           <w:color w:val="555555"/>
           <w:sz w:val="18"/>
         </w:rPr>
-        <w:t xml:space="preserve">  [3]</w:t>
+        <w:t xml:space="preserve">  [4]</w:t>
       </w:r>
     </w:p>
     <w:p>
@@ -2013,7 +2013,7 @@
           <w:color w:val="555555"/>
           <w:sz w:val="22"/>
         </w:rPr>
-        <w:t>Total de entradas: 103</w:t>
+        <w:t>Total de entradas: 107</w:t>
       </w:r>
     </w:p>
     <w:p>
@@ -8323,6 +8323,266 @@
       </w:tr>
     </w:tbl>
     <w:p/>
+    <w:tbl>
+      <w:tblPr>
+        <w:tblW w:type="auto" w:w="0"/>
+        <w:jc w:val="center"/>
+        <w:tblLayout w:type="fixed"/>
+        <w:tblLook w:firstColumn="1" w:firstRow="1" w:lastColumn="0" w:lastRow="0" w:noHBand="0" w:noVBand="1" w:val="04A0"/>
+      </w:tblPr>
+      <w:tblGrid>
+        <w:gridCol w:w="8787"/>
+      </w:tblGrid>
+      <w:tr>
+        <w:tc>
+          <w:tcPr>
+            <w:tcW w:type="dxa" w:w="8787"/>
+            <w:shd w:val="clear" w:color="auto" w:fill="F0E6D5"/>
+            <w:tcBorders>
+              <w:top w:val="single" w:sz="4" w:color="D8D2C4"/>
+              <w:left w:val="single" w:sz="4" w:color="D8D2C4"/>
+              <w:bottom w:val="single" w:sz="4" w:color="D8D2C4"/>
+              <w:right w:val="single" w:sz="4" w:color="D8D2C4"/>
+            </w:tcBorders>
+          </w:tcPr>
+          <w:p>
+            <w:pPr>
+              <w:spacing w:after="40"/>
+            </w:pPr>
+            <w:r>
+              <w:rPr>
+                <w:b/>
+                <w:color w:val="6B1818"/>
+                <w:sz w:val="18"/>
+              </w:rPr>
+              <w:t xml:space="preserve">[JURISPRUDENCIA]  </w:t>
+            </w:r>
+            <w:r>
+              <w:rPr>
+                <w:color w:val="555555"/>
+                <w:sz w:val="18"/>
+              </w:rPr>
+              <w:t>Segunda Sala SCJN  ·  Duodécima Época  ·  Federal</w:t>
+            </w:r>
+          </w:p>
+        </w:tc>
+      </w:tr>
+      <w:tr>
+        <w:tc>
+          <w:tcPr>
+            <w:tcW w:type="dxa" w:w="8787"/>
+            <w:tcBorders>
+              <w:top w:val="single" w:sz="4" w:color="D8D2C4"/>
+              <w:left w:val="single" w:sz="4" w:color="D8D2C4"/>
+              <w:bottom w:val="single" w:sz="4" w:color="D8D2C4"/>
+              <w:right w:val="single" w:sz="4" w:color="D8D2C4"/>
+            </w:tcBorders>
+          </w:tcPr>
+          <w:p>
+            <w:pPr>
+              <w:jc w:val="both"/>
+            </w:pPr>
+            <w:r>
+              <w:rPr>
+                <w:b/>
+                <w:color w:val="6B1818"/>
+                <w:sz w:val="22"/>
+              </w:rPr>
+              <w:t xml:space="preserve">Rubro. </w:t>
+            </w:r>
+            <w:r>
+              <w:rPr>
+                <w:b/>
+                <w:sz w:val="22"/>
+              </w:rPr>
+              <w:t>CANCELACIÓN DE LICENCIA PARA CONDUCIR. LA PREVISTA EN LOS ARTÍCULOS 168 Y 26, FRACCIÓN XXX, DE LA LEY DE MOVILIDAD Y SEGURIDAD VIAL DEL ESTADO DE PUEBLA, ES INCONSTITUCIONAL.</w:t>
+            </w:r>
+          </w:p>
+        </w:tc>
+      </w:tr>
+      <w:tr>
+        <w:tc>
+          <w:tcPr>
+            <w:tcW w:type="dxa" w:w="8787"/>
+            <w:tcBorders>
+              <w:top w:val="single" w:sz="4" w:color="D8D2C4"/>
+              <w:left w:val="single" w:sz="4" w:color="D8D2C4"/>
+              <w:bottom w:val="single" w:sz="4" w:color="D8D2C4"/>
+              <w:right w:val="single" w:sz="4" w:color="D8D2C4"/>
+            </w:tcBorders>
+          </w:tcPr>
+          <w:p>
+            <w:r>
+              <w:rPr>
+                <w:i/>
+                <w:color w:val="555555"/>
+                <w:sz w:val="18"/>
+              </w:rPr>
+              <w:t>Subtema: Actualización automática semanal · Registro digital: 2032122 · Fecha: viernes 15 de mayo de 2026 10:20 h · Fuente: Semanario Judicial de la Federación — captura automática · Vigencia: vigente</w:t>
+            </w:r>
+          </w:p>
+        </w:tc>
+      </w:tr>
+      <w:tr>
+        <w:tc>
+          <w:tcPr>
+            <w:tcW w:type="dxa" w:w="8787"/>
+            <w:tcBorders>
+              <w:top w:val="single" w:sz="4" w:color="D8D2C4"/>
+              <w:left w:val="single" w:sz="4" w:color="D8D2C4"/>
+              <w:bottom w:val="single" w:sz="4" w:color="D8D2C4"/>
+              <w:right w:val="single" w:sz="4" w:color="D8D2C4"/>
+            </w:tcBorders>
+          </w:tcPr>
+          <w:p>
+            <w:r>
+              <w:rPr>
+                <w:b/>
+                <w:color w:val="6B1818"/>
+                <w:sz w:val="18"/>
+              </w:rPr>
+              <w:t xml:space="preserve">Consulta SJF/SCJN: </w:t>
+            </w:r>
+            <w:r>
+              <w:rPr>
+                <w:color w:val="6B1818"/>
+                <w:sz w:val="18"/>
+                <w:u w:val="single"/>
+              </w:rPr>
+              <w:t>https://sjf2.scjn.gob.mx/detalle/tesis/2032122</w:t>
+            </w:r>
+          </w:p>
+        </w:tc>
+      </w:tr>
+      <w:tr>
+        <w:tc>
+          <w:tcPr>
+            <w:tcW w:type="dxa" w:w="8787"/>
+            <w:tcBorders>
+              <w:top w:val="single" w:sz="4" w:color="D8D2C4"/>
+              <w:left w:val="single" w:sz="4" w:color="D8D2C4"/>
+              <w:bottom w:val="single" w:sz="4" w:color="D8D2C4"/>
+              <w:right w:val="single" w:sz="4" w:color="D8D2C4"/>
+            </w:tcBorders>
+          </w:tcPr>
+          <w:p>
+            <w:pPr>
+              <w:jc w:val="both"/>
+            </w:pPr>
+            <w:r>
+              <w:rPr>
+                <w:b/>
+                <w:color w:val="6B1818"/>
+                <w:sz w:val="20"/>
+              </w:rPr>
+              <w:t xml:space="preserve">Texto. </w:t>
+            </w:r>
+            <w:r>
+              <w:rPr>
+                <w:sz w:val="20"/>
+              </w:rPr>
+              <w:t>Criterio publicado esta semana en el Semanario Judicial de la Federación. Ver texto íntegro en el SJF mediante el enlace directo.</w:t>
+            </w:r>
+          </w:p>
+        </w:tc>
+      </w:tr>
+      <w:tr>
+        <w:tc>
+          <w:tcPr>
+            <w:tcW w:type="dxa" w:w="8787"/>
+            <w:tcBorders>
+              <w:top w:val="single" w:sz="4" w:color="D8D2C4"/>
+              <w:left w:val="single" w:sz="4" w:color="D8D2C4"/>
+              <w:bottom w:val="single" w:sz="4" w:color="D8D2C4"/>
+              <w:right w:val="single" w:sz="4" w:color="D8D2C4"/>
+            </w:tcBorders>
+          </w:tcPr>
+          <w:p>
+            <w:pPr>
+              <w:jc w:val="both"/>
+            </w:pPr>
+            <w:r>
+              <w:rPr>
+                <w:b/>
+                <w:color w:val="6B1818"/>
+                <w:sz w:val="20"/>
+              </w:rPr>
+              <w:t xml:space="preserve">Trascendencia. </w:t>
+            </w:r>
+            <w:r>
+              <w:rPr>
+                <w:i/>
+                <w:sz w:val="20"/>
+              </w:rPr>
+              <w:t>Incorporada automáticamente en la actualización semanal. Pendiente de análisis editorial.</w:t>
+            </w:r>
+          </w:p>
+        </w:tc>
+      </w:tr>
+      <w:tr>
+        <w:tc>
+          <w:tcPr>
+            <w:tcW w:type="dxa" w:w="8787"/>
+            <w:tcBorders>
+              <w:top w:val="single" w:sz="4" w:color="D8D2C4"/>
+              <w:left w:val="single" w:sz="4" w:color="D8D2C4"/>
+              <w:bottom w:val="single" w:sz="4" w:color="D8D2C4"/>
+              <w:right w:val="single" w:sz="4" w:color="D8D2C4"/>
+            </w:tcBorders>
+          </w:tcPr>
+          <w:p>
+            <w:pPr>
+              <w:jc w:val="both"/>
+            </w:pPr>
+            <w:r>
+              <w:rPr>
+                <w:b/>
+                <w:color w:val="6B1818"/>
+                <w:sz w:val="20"/>
+              </w:rPr>
+              <w:t xml:space="preserve">Explicación práctica. </w:t>
+            </w:r>
+            <w:r>
+              <w:rPr>
+                <w:sz w:val="20"/>
+              </w:rPr>
+              <w:t>Tesis nueva detectada por el robot semanal. Revisa el texto completo en el SJF.</w:t>
+            </w:r>
+          </w:p>
+        </w:tc>
+      </w:tr>
+      <w:tr>
+        <w:tc>
+          <w:tcPr>
+            <w:tcW w:type="dxa" w:w="8787"/>
+            <w:tcBorders>
+              <w:top w:val="single" w:sz="4" w:color="D8D2C4"/>
+              <w:left w:val="single" w:sz="4" w:color="D8D2C4"/>
+              <w:bottom w:val="single" w:sz="4" w:color="D8D2C4"/>
+              <w:right w:val="single" w:sz="4" w:color="D8D2C4"/>
+            </w:tcBorders>
+          </w:tcPr>
+          <w:p>
+            <w:r>
+              <w:rPr>
+                <w:b/>
+                <w:color w:val="555555"/>
+                <w:sz w:val="18"/>
+              </w:rPr>
+              <w:t xml:space="preserve">Etiquetas: </w:t>
+            </w:r>
+            <w:r>
+              <w:rPr>
+                <w:color w:val="555555"/>
+                <w:sz w:val="18"/>
+              </w:rPr>
+              <w:t>#Responsabilidad administrativa de servidores públicos · #actualización automática</w:t>
+            </w:r>
+          </w:p>
+        </w:tc>
+      </w:tr>
+    </w:tbl>
+    <w:p/>
     <w:p>
       <w:pPr>
         <w:ind w:left="170"/>
@@ -18381,6 +18641,266 @@
         <w:t>› Tortura</w:t>
       </w:r>
     </w:p>
+    <w:tbl>
+      <w:tblPr>
+        <w:tblW w:type="auto" w:w="0"/>
+        <w:jc w:val="center"/>
+        <w:tblLayout w:type="fixed"/>
+        <w:tblLook w:firstColumn="1" w:firstRow="1" w:lastColumn="0" w:lastRow="0" w:noHBand="0" w:noVBand="1" w:val="04A0"/>
+      </w:tblPr>
+      <w:tblGrid>
+        <w:gridCol w:w="8787"/>
+      </w:tblGrid>
+      <w:tr>
+        <w:tc>
+          <w:tcPr>
+            <w:tcW w:type="dxa" w:w="8787"/>
+            <w:shd w:val="clear" w:color="auto" w:fill="F0E6D5"/>
+            <w:tcBorders>
+              <w:top w:val="single" w:sz="4" w:color="D8D2C4"/>
+              <w:left w:val="single" w:sz="4" w:color="D8D2C4"/>
+              <w:bottom w:val="single" w:sz="4" w:color="D8D2C4"/>
+              <w:right w:val="single" w:sz="4" w:color="D8D2C4"/>
+            </w:tcBorders>
+          </w:tcPr>
+          <w:p>
+            <w:pPr>
+              <w:spacing w:after="40"/>
+            </w:pPr>
+            <w:r>
+              <w:rPr>
+                <w:b/>
+                <w:color w:val="6B1818"/>
+                <w:sz w:val="18"/>
+              </w:rPr>
+              <w:t xml:space="preserve">[JURISPRUDENCIA]  </w:t>
+            </w:r>
+            <w:r>
+              <w:rPr>
+                <w:color w:val="555555"/>
+                <w:sz w:val="18"/>
+              </w:rPr>
+              <w:t>Segunda Sala SCJN  ·  Duodécima Época  ·  Federal</w:t>
+            </w:r>
+          </w:p>
+        </w:tc>
+      </w:tr>
+      <w:tr>
+        <w:tc>
+          <w:tcPr>
+            <w:tcW w:type="dxa" w:w="8787"/>
+            <w:tcBorders>
+              <w:top w:val="single" w:sz="4" w:color="D8D2C4"/>
+              <w:left w:val="single" w:sz="4" w:color="D8D2C4"/>
+              <w:bottom w:val="single" w:sz="4" w:color="D8D2C4"/>
+              <w:right w:val="single" w:sz="4" w:color="D8D2C4"/>
+            </w:tcBorders>
+          </w:tcPr>
+          <w:p>
+            <w:pPr>
+              <w:jc w:val="both"/>
+            </w:pPr>
+            <w:r>
+              <w:rPr>
+                <w:b/>
+                <w:color w:val="6B1818"/>
+                <w:sz w:val="22"/>
+              </w:rPr>
+              <w:t xml:space="preserve">Rubro. </w:t>
+            </w:r>
+            <w:r>
+              <w:rPr>
+                <w:b/>
+                <w:sz w:val="22"/>
+              </w:rPr>
+              <w:t>TORTURA Y OTROS TRATOS O PENAS CRUELES, INHUMANOS O DEGRADANTES EN EL ESTADO DE TAMAULIPAS. EL ARTÍCULO 3 DE LA LEY RELATIVA ES INCONSTITUCIONAL, AL ESTABLECER LA APLICACIÓN SUPLETORIA DE LA LEY GENERAL DE LA MATERIA.</w:t>
+            </w:r>
+          </w:p>
+        </w:tc>
+      </w:tr>
+      <w:tr>
+        <w:tc>
+          <w:tcPr>
+            <w:tcW w:type="dxa" w:w="8787"/>
+            <w:tcBorders>
+              <w:top w:val="single" w:sz="4" w:color="D8D2C4"/>
+              <w:left w:val="single" w:sz="4" w:color="D8D2C4"/>
+              <w:bottom w:val="single" w:sz="4" w:color="D8D2C4"/>
+              <w:right w:val="single" w:sz="4" w:color="D8D2C4"/>
+            </w:tcBorders>
+          </w:tcPr>
+          <w:p>
+            <w:r>
+              <w:rPr>
+                <w:i/>
+                <w:color w:val="555555"/>
+                <w:sz w:val="18"/>
+              </w:rPr>
+              <w:t>Subtema: Actualización automática semanal · Registro digital: 2032145 · Fecha: viernes 15 de mayo de 2026 10:20 h · Fuente: Semanario Judicial de la Federación — captura automática · Vigencia: vigente</w:t>
+            </w:r>
+          </w:p>
+        </w:tc>
+      </w:tr>
+      <w:tr>
+        <w:tc>
+          <w:tcPr>
+            <w:tcW w:type="dxa" w:w="8787"/>
+            <w:tcBorders>
+              <w:top w:val="single" w:sz="4" w:color="D8D2C4"/>
+              <w:left w:val="single" w:sz="4" w:color="D8D2C4"/>
+              <w:bottom w:val="single" w:sz="4" w:color="D8D2C4"/>
+              <w:right w:val="single" w:sz="4" w:color="D8D2C4"/>
+            </w:tcBorders>
+          </w:tcPr>
+          <w:p>
+            <w:r>
+              <w:rPr>
+                <w:b/>
+                <w:color w:val="6B1818"/>
+                <w:sz w:val="18"/>
+              </w:rPr>
+              <w:t xml:space="preserve">Consulta SJF/SCJN: </w:t>
+            </w:r>
+            <w:r>
+              <w:rPr>
+                <w:color w:val="6B1818"/>
+                <w:sz w:val="18"/>
+                <w:u w:val="single"/>
+              </w:rPr>
+              <w:t>https://sjf2.scjn.gob.mx/detalle/tesis/2032145</w:t>
+            </w:r>
+          </w:p>
+        </w:tc>
+      </w:tr>
+      <w:tr>
+        <w:tc>
+          <w:tcPr>
+            <w:tcW w:type="dxa" w:w="8787"/>
+            <w:tcBorders>
+              <w:top w:val="single" w:sz="4" w:color="D8D2C4"/>
+              <w:left w:val="single" w:sz="4" w:color="D8D2C4"/>
+              <w:bottom w:val="single" w:sz="4" w:color="D8D2C4"/>
+              <w:right w:val="single" w:sz="4" w:color="D8D2C4"/>
+            </w:tcBorders>
+          </w:tcPr>
+          <w:p>
+            <w:pPr>
+              <w:jc w:val="both"/>
+            </w:pPr>
+            <w:r>
+              <w:rPr>
+                <w:b/>
+                <w:color w:val="6B1818"/>
+                <w:sz w:val="20"/>
+              </w:rPr>
+              <w:t xml:space="preserve">Texto. </w:t>
+            </w:r>
+            <w:r>
+              <w:rPr>
+                <w:sz w:val="20"/>
+              </w:rPr>
+              <w:t>Criterio publicado esta semana en el Semanario Judicial de la Federación. Ver texto íntegro en el SJF mediante el enlace directo.</w:t>
+            </w:r>
+          </w:p>
+        </w:tc>
+      </w:tr>
+      <w:tr>
+        <w:tc>
+          <w:tcPr>
+            <w:tcW w:type="dxa" w:w="8787"/>
+            <w:tcBorders>
+              <w:top w:val="single" w:sz="4" w:color="D8D2C4"/>
+              <w:left w:val="single" w:sz="4" w:color="D8D2C4"/>
+              <w:bottom w:val="single" w:sz="4" w:color="D8D2C4"/>
+              <w:right w:val="single" w:sz="4" w:color="D8D2C4"/>
+            </w:tcBorders>
+          </w:tcPr>
+          <w:p>
+            <w:pPr>
+              <w:jc w:val="both"/>
+            </w:pPr>
+            <w:r>
+              <w:rPr>
+                <w:b/>
+                <w:color w:val="6B1818"/>
+                <w:sz w:val="20"/>
+              </w:rPr>
+              <w:t xml:space="preserve">Trascendencia. </w:t>
+            </w:r>
+            <w:r>
+              <w:rPr>
+                <w:i/>
+                <w:sz w:val="20"/>
+              </w:rPr>
+              <w:t>Incorporada automáticamente en la actualización semanal. Pendiente de análisis editorial.</w:t>
+            </w:r>
+          </w:p>
+        </w:tc>
+      </w:tr>
+      <w:tr>
+        <w:tc>
+          <w:tcPr>
+            <w:tcW w:type="dxa" w:w="8787"/>
+            <w:tcBorders>
+              <w:top w:val="single" w:sz="4" w:color="D8D2C4"/>
+              <w:left w:val="single" w:sz="4" w:color="D8D2C4"/>
+              <w:bottom w:val="single" w:sz="4" w:color="D8D2C4"/>
+              <w:right w:val="single" w:sz="4" w:color="D8D2C4"/>
+            </w:tcBorders>
+          </w:tcPr>
+          <w:p>
+            <w:pPr>
+              <w:jc w:val="both"/>
+            </w:pPr>
+            <w:r>
+              <w:rPr>
+                <w:b/>
+                <w:color w:val="6B1818"/>
+                <w:sz w:val="20"/>
+              </w:rPr>
+              <w:t xml:space="preserve">Explicación práctica. </w:t>
+            </w:r>
+            <w:r>
+              <w:rPr>
+                <w:sz w:val="20"/>
+              </w:rPr>
+              <w:t>Tesis nueva detectada por el robot semanal. Revisa el texto completo en el SJF.</w:t>
+            </w:r>
+          </w:p>
+        </w:tc>
+      </w:tr>
+      <w:tr>
+        <w:tc>
+          <w:tcPr>
+            <w:tcW w:type="dxa" w:w="8787"/>
+            <w:tcBorders>
+              <w:top w:val="single" w:sz="4" w:color="D8D2C4"/>
+              <w:left w:val="single" w:sz="4" w:color="D8D2C4"/>
+              <w:bottom w:val="single" w:sz="4" w:color="D8D2C4"/>
+              <w:right w:val="single" w:sz="4" w:color="D8D2C4"/>
+            </w:tcBorders>
+          </w:tcPr>
+          <w:p>
+            <w:r>
+              <w:rPr>
+                <w:b/>
+                <w:color w:val="555555"/>
+                <w:sz w:val="18"/>
+              </w:rPr>
+              <w:t xml:space="preserve">Etiquetas: </w:t>
+            </w:r>
+            <w:r>
+              <w:rPr>
+                <w:color w:val="555555"/>
+                <w:sz w:val="18"/>
+              </w:rPr>
+              <w:t>#Tortura · #actualización automática</w:t>
+            </w:r>
+          </w:p>
+        </w:tc>
+      </w:tr>
+    </w:tbl>
+    <w:p/>
     <w:tbl>
       <w:tblPr>
         <w:tblW w:type="auto" w:w="0"/>
@@ -20315,6 +20835,266 @@
       </w:tr>
     </w:tbl>
     <w:p/>
+    <w:tbl>
+      <w:tblPr>
+        <w:tblW w:type="auto" w:w="0"/>
+        <w:jc w:val="center"/>
+        <w:tblLayout w:type="fixed"/>
+        <w:tblLook w:firstColumn="1" w:firstRow="1" w:lastColumn="0" w:lastRow="0" w:noHBand="0" w:noVBand="1" w:val="04A0"/>
+      </w:tblPr>
+      <w:tblGrid>
+        <w:gridCol w:w="8787"/>
+      </w:tblGrid>
+      <w:tr>
+        <w:tc>
+          <w:tcPr>
+            <w:tcW w:type="dxa" w:w="8787"/>
+            <w:shd w:val="clear" w:color="auto" w:fill="F0E6D5"/>
+            <w:tcBorders>
+              <w:top w:val="single" w:sz="4" w:color="D8D2C4"/>
+              <w:left w:val="single" w:sz="4" w:color="D8D2C4"/>
+              <w:bottom w:val="single" w:sz="4" w:color="D8D2C4"/>
+              <w:right w:val="single" w:sz="4" w:color="D8D2C4"/>
+            </w:tcBorders>
+          </w:tcPr>
+          <w:p>
+            <w:pPr>
+              <w:spacing w:after="40"/>
+            </w:pPr>
+            <w:r>
+              <w:rPr>
+                <w:b/>
+                <w:color w:val="6B1818"/>
+                <w:sz w:val="18"/>
+              </w:rPr>
+              <w:t xml:space="preserve">[TESIS AISLADA]  </w:t>
+            </w:r>
+            <w:r>
+              <w:rPr>
+                <w:color w:val="555555"/>
+                <w:sz w:val="18"/>
+              </w:rPr>
+              <w:t>Tribunales Colegiados de Circuito  ·  Duodécima Época  ·  Federal</w:t>
+            </w:r>
+          </w:p>
+        </w:tc>
+      </w:tr>
+      <w:tr>
+        <w:tc>
+          <w:tcPr>
+            <w:tcW w:type="dxa" w:w="8787"/>
+            <w:tcBorders>
+              <w:top w:val="single" w:sz="4" w:color="D8D2C4"/>
+              <w:left w:val="single" w:sz="4" w:color="D8D2C4"/>
+              <w:bottom w:val="single" w:sz="4" w:color="D8D2C4"/>
+              <w:right w:val="single" w:sz="4" w:color="D8D2C4"/>
+            </w:tcBorders>
+          </w:tcPr>
+          <w:p>
+            <w:pPr>
+              <w:jc w:val="both"/>
+            </w:pPr>
+            <w:r>
+              <w:rPr>
+                <w:b/>
+                <w:color w:val="6B1818"/>
+                <w:sz w:val="22"/>
+              </w:rPr>
+              <w:t xml:space="preserve">Rubro. </w:t>
+            </w:r>
+            <w:r>
+              <w:rPr>
+                <w:b/>
+                <w:sz w:val="22"/>
+              </w:rPr>
+              <w:t>PENSIONES EN EL ESTADO DE JALISCO. EL ARTÍCULO 52 DE LA LEY DEL INSTITUTO DE PENSIONES DE LA ENTIDAD FEDERATIVA VIOLA EL DERECHO A LA SEGURIDAD SOCIAL.</w:t>
+            </w:r>
+          </w:p>
+        </w:tc>
+      </w:tr>
+      <w:tr>
+        <w:tc>
+          <w:tcPr>
+            <w:tcW w:type="dxa" w:w="8787"/>
+            <w:tcBorders>
+              <w:top w:val="single" w:sz="4" w:color="D8D2C4"/>
+              <w:left w:val="single" w:sz="4" w:color="D8D2C4"/>
+              <w:bottom w:val="single" w:sz="4" w:color="D8D2C4"/>
+              <w:right w:val="single" w:sz="4" w:color="D8D2C4"/>
+            </w:tcBorders>
+          </w:tcPr>
+          <w:p>
+            <w:r>
+              <w:rPr>
+                <w:i/>
+                <w:color w:val="555555"/>
+                <w:sz w:val="18"/>
+              </w:rPr>
+              <w:t>Subtema: Actualización automática semanal · Registro digital: 2032131 · Fecha: viernes 15 de mayo de 2026 10:20 h · Fuente: Semanario Judicial de la Federación — captura automática · Vigencia: vigente</w:t>
+            </w:r>
+          </w:p>
+        </w:tc>
+      </w:tr>
+      <w:tr>
+        <w:tc>
+          <w:tcPr>
+            <w:tcW w:type="dxa" w:w="8787"/>
+            <w:tcBorders>
+              <w:top w:val="single" w:sz="4" w:color="D8D2C4"/>
+              <w:left w:val="single" w:sz="4" w:color="D8D2C4"/>
+              <w:bottom w:val="single" w:sz="4" w:color="D8D2C4"/>
+              <w:right w:val="single" w:sz="4" w:color="D8D2C4"/>
+            </w:tcBorders>
+          </w:tcPr>
+          <w:p>
+            <w:r>
+              <w:rPr>
+                <w:b/>
+                <w:color w:val="6B1818"/>
+                <w:sz w:val="18"/>
+              </w:rPr>
+              <w:t xml:space="preserve">Consulta SJF/SCJN: </w:t>
+            </w:r>
+            <w:r>
+              <w:rPr>
+                <w:color w:val="6B1818"/>
+                <w:sz w:val="18"/>
+                <w:u w:val="single"/>
+              </w:rPr>
+              <w:t>https://sjf2.scjn.gob.mx/detalle/tesis/2032131</w:t>
+            </w:r>
+          </w:p>
+        </w:tc>
+      </w:tr>
+      <w:tr>
+        <w:tc>
+          <w:tcPr>
+            <w:tcW w:type="dxa" w:w="8787"/>
+            <w:tcBorders>
+              <w:top w:val="single" w:sz="4" w:color="D8D2C4"/>
+              <w:left w:val="single" w:sz="4" w:color="D8D2C4"/>
+              <w:bottom w:val="single" w:sz="4" w:color="D8D2C4"/>
+              <w:right w:val="single" w:sz="4" w:color="D8D2C4"/>
+            </w:tcBorders>
+          </w:tcPr>
+          <w:p>
+            <w:pPr>
+              <w:jc w:val="both"/>
+            </w:pPr>
+            <w:r>
+              <w:rPr>
+                <w:b/>
+                <w:color w:val="6B1818"/>
+                <w:sz w:val="20"/>
+              </w:rPr>
+              <w:t xml:space="preserve">Texto. </w:t>
+            </w:r>
+            <w:r>
+              <w:rPr>
+                <w:sz w:val="20"/>
+              </w:rPr>
+              <w:t>Criterio publicado esta semana en el Semanario Judicial de la Federación. Ver texto íntegro en el SJF mediante el enlace directo.</w:t>
+            </w:r>
+          </w:p>
+        </w:tc>
+      </w:tr>
+      <w:tr>
+        <w:tc>
+          <w:tcPr>
+            <w:tcW w:type="dxa" w:w="8787"/>
+            <w:tcBorders>
+              <w:top w:val="single" w:sz="4" w:color="D8D2C4"/>
+              <w:left w:val="single" w:sz="4" w:color="D8D2C4"/>
+              <w:bottom w:val="single" w:sz="4" w:color="D8D2C4"/>
+              <w:right w:val="single" w:sz="4" w:color="D8D2C4"/>
+            </w:tcBorders>
+          </w:tcPr>
+          <w:p>
+            <w:pPr>
+              <w:jc w:val="both"/>
+            </w:pPr>
+            <w:r>
+              <w:rPr>
+                <w:b/>
+                <w:color w:val="6B1818"/>
+                <w:sz w:val="20"/>
+              </w:rPr>
+              <w:t xml:space="preserve">Trascendencia. </w:t>
+            </w:r>
+            <w:r>
+              <w:rPr>
+                <w:i/>
+                <w:sz w:val="20"/>
+              </w:rPr>
+              <w:t>Incorporada automáticamente en la actualización semanal. Pendiente de análisis editorial.</w:t>
+            </w:r>
+          </w:p>
+        </w:tc>
+      </w:tr>
+      <w:tr>
+        <w:tc>
+          <w:tcPr>
+            <w:tcW w:type="dxa" w:w="8787"/>
+            <w:tcBorders>
+              <w:top w:val="single" w:sz="4" w:color="D8D2C4"/>
+              <w:left w:val="single" w:sz="4" w:color="D8D2C4"/>
+              <w:bottom w:val="single" w:sz="4" w:color="D8D2C4"/>
+              <w:right w:val="single" w:sz="4" w:color="D8D2C4"/>
+            </w:tcBorders>
+          </w:tcPr>
+          <w:p>
+            <w:pPr>
+              <w:jc w:val="both"/>
+            </w:pPr>
+            <w:r>
+              <w:rPr>
+                <w:b/>
+                <w:color w:val="6B1818"/>
+                <w:sz w:val="20"/>
+              </w:rPr>
+              <w:t xml:space="preserve">Explicación práctica. </w:t>
+            </w:r>
+            <w:r>
+              <w:rPr>
+                <w:sz w:val="20"/>
+              </w:rPr>
+              <w:t>Tesis nueva detectada por el robot semanal. Revisa el texto completo en el SJF.</w:t>
+            </w:r>
+          </w:p>
+        </w:tc>
+      </w:tr>
+      <w:tr>
+        <w:tc>
+          <w:tcPr>
+            <w:tcW w:type="dxa" w:w="8787"/>
+            <w:tcBorders>
+              <w:top w:val="single" w:sz="4" w:color="D8D2C4"/>
+              <w:left w:val="single" w:sz="4" w:color="D8D2C4"/>
+              <w:bottom w:val="single" w:sz="4" w:color="D8D2C4"/>
+              <w:right w:val="single" w:sz="4" w:color="D8D2C4"/>
+            </w:tcBorders>
+          </w:tcPr>
+          <w:p>
+            <w:r>
+              <w:rPr>
+                <w:b/>
+                <w:color w:val="555555"/>
+                <w:sz w:val="18"/>
+              </w:rPr>
+              <w:t xml:space="preserve">Etiquetas: </w:t>
+            </w:r>
+            <w:r>
+              <w:rPr>
+                <w:color w:val="555555"/>
+                <w:sz w:val="18"/>
+              </w:rPr>
+              <w:t>#Derecho humano a la salud · #actualización automática</w:t>
+            </w:r>
+          </w:p>
+        </w:tc>
+      </w:tr>
+    </w:tbl>
+    <w:p/>
     <w:p>
       <w:r>
         <w:rPr>
@@ -23033,6 +23813,266 @@
         <w:t>› Juicio hipotecario</w:t>
       </w:r>
     </w:p>
+    <w:tbl>
+      <w:tblPr>
+        <w:tblW w:type="auto" w:w="0"/>
+        <w:jc w:val="center"/>
+        <w:tblLayout w:type="fixed"/>
+        <w:tblLook w:firstColumn="1" w:firstRow="1" w:lastColumn="0" w:lastRow="0" w:noHBand="0" w:noVBand="1" w:val="04A0"/>
+      </w:tblPr>
+      <w:tblGrid>
+        <w:gridCol w:w="8787"/>
+      </w:tblGrid>
+      <w:tr>
+        <w:tc>
+          <w:tcPr>
+            <w:tcW w:type="dxa" w:w="8787"/>
+            <w:shd w:val="clear" w:color="auto" w:fill="F0E6D5"/>
+            <w:tcBorders>
+              <w:top w:val="single" w:sz="4" w:color="D8D2C4"/>
+              <w:left w:val="single" w:sz="4" w:color="D8D2C4"/>
+              <w:bottom w:val="single" w:sz="4" w:color="D8D2C4"/>
+              <w:right w:val="single" w:sz="4" w:color="D8D2C4"/>
+            </w:tcBorders>
+          </w:tcPr>
+          <w:p>
+            <w:pPr>
+              <w:spacing w:after="40"/>
+            </w:pPr>
+            <w:r>
+              <w:rPr>
+                <w:b/>
+                <w:color w:val="6B1818"/>
+                <w:sz w:val="18"/>
+              </w:rPr>
+              <w:t xml:space="preserve">[TESIS AISLADA]  </w:t>
+            </w:r>
+            <w:r>
+              <w:rPr>
+                <w:color w:val="555555"/>
+                <w:sz w:val="18"/>
+              </w:rPr>
+              <w:t>Tribunales Colegiados de Circuito  ·  Duodécima Época  ·  Federal</w:t>
+            </w:r>
+          </w:p>
+        </w:tc>
+      </w:tr>
+      <w:tr>
+        <w:tc>
+          <w:tcPr>
+            <w:tcW w:type="dxa" w:w="8787"/>
+            <w:tcBorders>
+              <w:top w:val="single" w:sz="4" w:color="D8D2C4"/>
+              <w:left w:val="single" w:sz="4" w:color="D8D2C4"/>
+              <w:bottom w:val="single" w:sz="4" w:color="D8D2C4"/>
+              <w:right w:val="single" w:sz="4" w:color="D8D2C4"/>
+            </w:tcBorders>
+          </w:tcPr>
+          <w:p>
+            <w:pPr>
+              <w:jc w:val="both"/>
+            </w:pPr>
+            <w:r>
+              <w:rPr>
+                <w:b/>
+                <w:color w:val="6B1818"/>
+                <w:sz w:val="22"/>
+              </w:rPr>
+              <w:t xml:space="preserve">Rubro. </w:t>
+            </w:r>
+            <w:r>
+              <w:rPr>
+                <w:b/>
+                <w:sz w:val="22"/>
+              </w:rPr>
+              <w:t>CRÉDITOS HIPOTECARIOS OTORGADOS POR LAS INSTITUCIONES FINANCIERAS A SUS PERSONAS TRABAJADORAS. EL ESTUDIO SOBRE LA MODIFICACIÓN DE LAS CLÁUSULAS QUE CONTENGAN UN BENEFICIO OTORGADO DERIVADO DE LA RELACIÓN LABORAL PROCEDE EN ESTA VÍA.</w:t>
+            </w:r>
+          </w:p>
+        </w:tc>
+      </w:tr>
+      <w:tr>
+        <w:tc>
+          <w:tcPr>
+            <w:tcW w:type="dxa" w:w="8787"/>
+            <w:tcBorders>
+              <w:top w:val="single" w:sz="4" w:color="D8D2C4"/>
+              <w:left w:val="single" w:sz="4" w:color="D8D2C4"/>
+              <w:bottom w:val="single" w:sz="4" w:color="D8D2C4"/>
+              <w:right w:val="single" w:sz="4" w:color="D8D2C4"/>
+            </w:tcBorders>
+          </w:tcPr>
+          <w:p>
+            <w:r>
+              <w:rPr>
+                <w:i/>
+                <w:color w:val="555555"/>
+                <w:sz w:val="18"/>
+              </w:rPr>
+              <w:t>Subtema: Actualización automática semanal · Registro digital: 2032124 · Fecha: viernes 15 de mayo de 2026 10:20 h · Fuente: Semanario Judicial de la Federación — captura automática · Vigencia: vigente</w:t>
+            </w:r>
+          </w:p>
+        </w:tc>
+      </w:tr>
+      <w:tr>
+        <w:tc>
+          <w:tcPr>
+            <w:tcW w:type="dxa" w:w="8787"/>
+            <w:tcBorders>
+              <w:top w:val="single" w:sz="4" w:color="D8D2C4"/>
+              <w:left w:val="single" w:sz="4" w:color="D8D2C4"/>
+              <w:bottom w:val="single" w:sz="4" w:color="D8D2C4"/>
+              <w:right w:val="single" w:sz="4" w:color="D8D2C4"/>
+            </w:tcBorders>
+          </w:tcPr>
+          <w:p>
+            <w:r>
+              <w:rPr>
+                <w:b/>
+                <w:color w:val="6B1818"/>
+                <w:sz w:val="18"/>
+              </w:rPr>
+              <w:t xml:space="preserve">Consulta SJF/SCJN: </w:t>
+            </w:r>
+            <w:r>
+              <w:rPr>
+                <w:color w:val="6B1818"/>
+                <w:sz w:val="18"/>
+                <w:u w:val="single"/>
+              </w:rPr>
+              <w:t>https://sjf2.scjn.gob.mx/detalle/tesis/2032124</w:t>
+            </w:r>
+          </w:p>
+        </w:tc>
+      </w:tr>
+      <w:tr>
+        <w:tc>
+          <w:tcPr>
+            <w:tcW w:type="dxa" w:w="8787"/>
+            <w:tcBorders>
+              <w:top w:val="single" w:sz="4" w:color="D8D2C4"/>
+              <w:left w:val="single" w:sz="4" w:color="D8D2C4"/>
+              <w:bottom w:val="single" w:sz="4" w:color="D8D2C4"/>
+              <w:right w:val="single" w:sz="4" w:color="D8D2C4"/>
+            </w:tcBorders>
+          </w:tcPr>
+          <w:p>
+            <w:pPr>
+              <w:jc w:val="both"/>
+            </w:pPr>
+            <w:r>
+              <w:rPr>
+                <w:b/>
+                <w:color w:val="6B1818"/>
+                <w:sz w:val="20"/>
+              </w:rPr>
+              <w:t xml:space="preserve">Texto. </w:t>
+            </w:r>
+            <w:r>
+              <w:rPr>
+                <w:sz w:val="20"/>
+              </w:rPr>
+              <w:t>Criterio publicado esta semana en el Semanario Judicial de la Federación. Ver texto íntegro en el SJF mediante el enlace directo.</w:t>
+            </w:r>
+          </w:p>
+        </w:tc>
+      </w:tr>
+      <w:tr>
+        <w:tc>
+          <w:tcPr>
+            <w:tcW w:type="dxa" w:w="8787"/>
+            <w:tcBorders>
+              <w:top w:val="single" w:sz="4" w:color="D8D2C4"/>
+              <w:left w:val="single" w:sz="4" w:color="D8D2C4"/>
+              <w:bottom w:val="single" w:sz="4" w:color="D8D2C4"/>
+              <w:right w:val="single" w:sz="4" w:color="D8D2C4"/>
+            </w:tcBorders>
+          </w:tcPr>
+          <w:p>
+            <w:pPr>
+              <w:jc w:val="both"/>
+            </w:pPr>
+            <w:r>
+              <w:rPr>
+                <w:b/>
+                <w:color w:val="6B1818"/>
+                <w:sz w:val="20"/>
+              </w:rPr>
+              <w:t xml:space="preserve">Trascendencia. </w:t>
+            </w:r>
+            <w:r>
+              <w:rPr>
+                <w:i/>
+                <w:sz w:val="20"/>
+              </w:rPr>
+              <w:t>Incorporada automáticamente en la actualización semanal. Pendiente de análisis editorial.</w:t>
+            </w:r>
+          </w:p>
+        </w:tc>
+      </w:tr>
+      <w:tr>
+        <w:tc>
+          <w:tcPr>
+            <w:tcW w:type="dxa" w:w="8787"/>
+            <w:tcBorders>
+              <w:top w:val="single" w:sz="4" w:color="D8D2C4"/>
+              <w:left w:val="single" w:sz="4" w:color="D8D2C4"/>
+              <w:bottom w:val="single" w:sz="4" w:color="D8D2C4"/>
+              <w:right w:val="single" w:sz="4" w:color="D8D2C4"/>
+            </w:tcBorders>
+          </w:tcPr>
+          <w:p>
+            <w:pPr>
+              <w:jc w:val="both"/>
+            </w:pPr>
+            <w:r>
+              <w:rPr>
+                <w:b/>
+                <w:color w:val="6B1818"/>
+                <w:sz w:val="20"/>
+              </w:rPr>
+              <w:t xml:space="preserve">Explicación práctica. </w:t>
+            </w:r>
+            <w:r>
+              <w:rPr>
+                <w:sz w:val="20"/>
+              </w:rPr>
+              <w:t>Tesis nueva detectada por el robot semanal. Revisa el texto completo en el SJF.</w:t>
+            </w:r>
+          </w:p>
+        </w:tc>
+      </w:tr>
+      <w:tr>
+        <w:tc>
+          <w:tcPr>
+            <w:tcW w:type="dxa" w:w="8787"/>
+            <w:tcBorders>
+              <w:top w:val="single" w:sz="4" w:color="D8D2C4"/>
+              <w:left w:val="single" w:sz="4" w:color="D8D2C4"/>
+              <w:bottom w:val="single" w:sz="4" w:color="D8D2C4"/>
+              <w:right w:val="single" w:sz="4" w:color="D8D2C4"/>
+            </w:tcBorders>
+          </w:tcPr>
+          <w:p>
+            <w:r>
+              <w:rPr>
+                <w:b/>
+                <w:color w:val="555555"/>
+                <w:sz w:val="18"/>
+              </w:rPr>
+              <w:t xml:space="preserve">Etiquetas: </w:t>
+            </w:r>
+            <w:r>
+              <w:rPr>
+                <w:color w:val="555555"/>
+                <w:sz w:val="18"/>
+              </w:rPr>
+              <w:t>#Juicio hipotecario · #actualización automática</w:t>
+            </w:r>
+          </w:p>
+        </w:tc>
+      </w:tr>
+    </w:tbl>
+    <w:p/>
     <w:tbl>
       <w:tblPr>
         <w:tblW w:type="auto" w:w="0"/>

</xml_diff>

<commit_message>
Actualizacion semanal automatica 2026-05-23
</commit_message>
<xml_diff>
--- a/Acervo_Jurisprudencial.docx
+++ b/Acervo_Jurisprudencial.docx
@@ -1409,7 +1409,7 @@
           <w:color w:val="555555"/>
           <w:sz w:val="20"/>
         </w:rPr>
-        <w:t xml:space="preserve">  (5)</w:t>
+        <w:t xml:space="preserve">  (6)</w:t>
       </w:r>
     </w:p>
     <w:p>
@@ -1448,6 +1448,25 @@
           <w:sz w:val="18"/>
         </w:rPr>
         <w:t xml:space="preserve">  [4]</w:t>
+      </w:r>
+    </w:p>
+    <w:p>
+      <w:pPr>
+        <w:ind w:left="794"/>
+      </w:pPr>
+      <w:r>
+        <w:rPr>
+          <w:color w:val="555555"/>
+          <w:sz w:val="20"/>
+        </w:rPr>
+        <w:t xml:space="preserve">      › Responsabilidad administrativa de servidores públicos</w:t>
+      </w:r>
+      <w:r>
+        <w:rPr>
+          <w:color w:val="555555"/>
+          <w:sz w:val="18"/>
+        </w:rPr>
+        <w:t xml:space="preserve">  [1]</w:t>
       </w:r>
     </w:p>
     <w:p>
@@ -1732,7 +1751,7 @@
           <w:color w:val="555555"/>
           <w:sz w:val="20"/>
         </w:rPr>
-        <w:t xml:space="preserve">  (3)</w:t>
+        <w:t xml:space="preserve">  (5)</w:t>
       </w:r>
     </w:p>
     <w:p>
@@ -1745,6 +1764,25 @@
           <w:sz w:val="20"/>
         </w:rPr>
         <w:t xml:space="preserve">      › Derecho humano al cuidado</w:t>
+      </w:r>
+      <w:r>
+        <w:rPr>
+          <w:color w:val="555555"/>
+          <w:sz w:val="18"/>
+        </w:rPr>
+        <w:t xml:space="preserve">  [2]</w:t>
+      </w:r>
+    </w:p>
+    <w:p>
+      <w:pPr>
+        <w:ind w:left="794"/>
+      </w:pPr>
+      <w:r>
+        <w:rPr>
+          <w:color w:val="555555"/>
+          <w:sz w:val="20"/>
+        </w:rPr>
+        <w:t xml:space="preserve">      › Perspectiva de género</w:t>
       </w:r>
       <w:r>
         <w:rPr>
@@ -2013,7 +2051,7 @@
           <w:color w:val="555555"/>
           <w:sz w:val="22"/>
         </w:rPr>
-        <w:t>Total de entradas: 107</w:t>
+        <w:t>Total de entradas: 110</w:t>
       </w:r>
     </w:p>
     <w:p>
@@ -21096,6 +21134,280 @@
     </w:tbl>
     <w:p/>
     <w:p>
+      <w:pPr>
+        <w:ind w:left="170"/>
+      </w:pPr>
+      <w:r>
+        <w:rPr>
+          <w:b/>
+          <w:i/>
+          <w:color w:val="1A1A1A"/>
+          <w:sz w:val="24"/>
+        </w:rPr>
+        <w:t>› Responsabilidad administrativa de servidores públicos</w:t>
+      </w:r>
+    </w:p>
+    <w:tbl>
+      <w:tblPr>
+        <w:tblW w:type="auto" w:w="0"/>
+        <w:jc w:val="center"/>
+        <w:tblLayout w:type="fixed"/>
+        <w:tblLook w:firstColumn="1" w:firstRow="1" w:lastColumn="0" w:lastRow="0" w:noHBand="0" w:noVBand="1" w:val="04A0"/>
+      </w:tblPr>
+      <w:tblGrid>
+        <w:gridCol w:w="8787"/>
+      </w:tblGrid>
+      <w:tr>
+        <w:tc>
+          <w:tcPr>
+            <w:tcW w:type="dxa" w:w="8787"/>
+            <w:shd w:val="clear" w:color="auto" w:fill="F0E6D5"/>
+            <w:tcBorders>
+              <w:top w:val="single" w:sz="4" w:color="D8D2C4"/>
+              <w:left w:val="single" w:sz="4" w:color="D8D2C4"/>
+              <w:bottom w:val="single" w:sz="4" w:color="D8D2C4"/>
+              <w:right w:val="single" w:sz="4" w:color="D8D2C4"/>
+            </w:tcBorders>
+          </w:tcPr>
+          <w:p>
+            <w:pPr>
+              <w:spacing w:after="40"/>
+            </w:pPr>
+            <w:r>
+              <w:rPr>
+                <w:b/>
+                <w:color w:val="6B1818"/>
+                <w:sz w:val="18"/>
+              </w:rPr>
+              <w:t xml:space="preserve">[TESIS AISLADA]  </w:t>
+            </w:r>
+            <w:r>
+              <w:rPr>
+                <w:color w:val="555555"/>
+                <w:sz w:val="18"/>
+              </w:rPr>
+              <w:t>Tribunales Colegiados de Circuito  ·  Duodécima Época  ·  Federal</w:t>
+            </w:r>
+          </w:p>
+        </w:tc>
+      </w:tr>
+      <w:tr>
+        <w:tc>
+          <w:tcPr>
+            <w:tcW w:type="dxa" w:w="8787"/>
+            <w:tcBorders>
+              <w:top w:val="single" w:sz="4" w:color="D8D2C4"/>
+              <w:left w:val="single" w:sz="4" w:color="D8D2C4"/>
+              <w:bottom w:val="single" w:sz="4" w:color="D8D2C4"/>
+              <w:right w:val="single" w:sz="4" w:color="D8D2C4"/>
+            </w:tcBorders>
+          </w:tcPr>
+          <w:p>
+            <w:pPr>
+              <w:jc w:val="both"/>
+            </w:pPr>
+            <w:r>
+              <w:rPr>
+                <w:b/>
+                <w:color w:val="6B1818"/>
+                <w:sz w:val="22"/>
+              </w:rPr>
+              <w:t xml:space="preserve">Rubro. </w:t>
+            </w:r>
+            <w:r>
+              <w:rPr>
+                <w:b/>
+                <w:sz w:val="22"/>
+              </w:rPr>
+              <w:t>PRUEBAS EN EL JUICIO CONTENCIOSO ADMINISTRATIVO FEDERAL. EL ARTÍCULO 40, PÁRRAFO SEGUNDO, DE LA LEY FEDERAL DE PROCEDIMIENTO CONTENCIOSO ADMINISTRATIVO NO VIOLA EL DERECHO DE ACCESO A LA JUSTICIA.</w:t>
+            </w:r>
+          </w:p>
+        </w:tc>
+      </w:tr>
+      <w:tr>
+        <w:tc>
+          <w:tcPr>
+            <w:tcW w:type="dxa" w:w="8787"/>
+            <w:tcBorders>
+              <w:top w:val="single" w:sz="4" w:color="D8D2C4"/>
+              <w:left w:val="single" w:sz="4" w:color="D8D2C4"/>
+              <w:bottom w:val="single" w:sz="4" w:color="D8D2C4"/>
+              <w:right w:val="single" w:sz="4" w:color="D8D2C4"/>
+            </w:tcBorders>
+          </w:tcPr>
+          <w:p>
+            <w:r>
+              <w:rPr>
+                <w:i/>
+                <w:color w:val="555555"/>
+                <w:sz w:val="18"/>
+              </w:rPr>
+              <w:t>Subtema: Actualización automática semanal · Registro digital: 2032177 · Fecha: viernes 22 de mayo de 2026 10:27 h · Fuente: Semanario Judicial de la Federación — captura automática · Vigencia: vigente</w:t>
+            </w:r>
+          </w:p>
+        </w:tc>
+      </w:tr>
+      <w:tr>
+        <w:tc>
+          <w:tcPr>
+            <w:tcW w:type="dxa" w:w="8787"/>
+            <w:tcBorders>
+              <w:top w:val="single" w:sz="4" w:color="D8D2C4"/>
+              <w:left w:val="single" w:sz="4" w:color="D8D2C4"/>
+              <w:bottom w:val="single" w:sz="4" w:color="D8D2C4"/>
+              <w:right w:val="single" w:sz="4" w:color="D8D2C4"/>
+            </w:tcBorders>
+          </w:tcPr>
+          <w:p>
+            <w:r>
+              <w:rPr>
+                <w:b/>
+                <w:color w:val="6B1818"/>
+                <w:sz w:val="18"/>
+              </w:rPr>
+              <w:t xml:space="preserve">Consulta SJF/SCJN: </w:t>
+            </w:r>
+            <w:r>
+              <w:rPr>
+                <w:color w:val="6B1818"/>
+                <w:sz w:val="18"/>
+                <w:u w:val="single"/>
+              </w:rPr>
+              <w:t>https://sjf2.scjn.gob.mx/detalle/tesis/2032177</w:t>
+            </w:r>
+          </w:p>
+        </w:tc>
+      </w:tr>
+      <w:tr>
+        <w:tc>
+          <w:tcPr>
+            <w:tcW w:type="dxa" w:w="8787"/>
+            <w:tcBorders>
+              <w:top w:val="single" w:sz="4" w:color="D8D2C4"/>
+              <w:left w:val="single" w:sz="4" w:color="D8D2C4"/>
+              <w:bottom w:val="single" w:sz="4" w:color="D8D2C4"/>
+              <w:right w:val="single" w:sz="4" w:color="D8D2C4"/>
+            </w:tcBorders>
+          </w:tcPr>
+          <w:p>
+            <w:pPr>
+              <w:jc w:val="both"/>
+            </w:pPr>
+            <w:r>
+              <w:rPr>
+                <w:b/>
+                <w:color w:val="6B1818"/>
+                <w:sz w:val="20"/>
+              </w:rPr>
+              <w:t xml:space="preserve">Texto. </w:t>
+            </w:r>
+            <w:r>
+              <w:rPr>
+                <w:sz w:val="20"/>
+              </w:rPr>
+              <w:t>Criterio publicado esta semana en el Semanario Judicial de la Federación. Ver texto íntegro en el SJF mediante el enlace directo.</w:t>
+            </w:r>
+          </w:p>
+        </w:tc>
+      </w:tr>
+      <w:tr>
+        <w:tc>
+          <w:tcPr>
+            <w:tcW w:type="dxa" w:w="8787"/>
+            <w:tcBorders>
+              <w:top w:val="single" w:sz="4" w:color="D8D2C4"/>
+              <w:left w:val="single" w:sz="4" w:color="D8D2C4"/>
+              <w:bottom w:val="single" w:sz="4" w:color="D8D2C4"/>
+              <w:right w:val="single" w:sz="4" w:color="D8D2C4"/>
+            </w:tcBorders>
+          </w:tcPr>
+          <w:p>
+            <w:pPr>
+              <w:jc w:val="both"/>
+            </w:pPr>
+            <w:r>
+              <w:rPr>
+                <w:b/>
+                <w:color w:val="6B1818"/>
+                <w:sz w:val="20"/>
+              </w:rPr>
+              <w:t xml:space="preserve">Trascendencia. </w:t>
+            </w:r>
+            <w:r>
+              <w:rPr>
+                <w:i/>
+                <w:sz w:val="20"/>
+              </w:rPr>
+              <w:t>Incorporada automáticamente en la actualización semanal. Pendiente de análisis editorial.</w:t>
+            </w:r>
+          </w:p>
+        </w:tc>
+      </w:tr>
+      <w:tr>
+        <w:tc>
+          <w:tcPr>
+            <w:tcW w:type="dxa" w:w="8787"/>
+            <w:tcBorders>
+              <w:top w:val="single" w:sz="4" w:color="D8D2C4"/>
+              <w:left w:val="single" w:sz="4" w:color="D8D2C4"/>
+              <w:bottom w:val="single" w:sz="4" w:color="D8D2C4"/>
+              <w:right w:val="single" w:sz="4" w:color="D8D2C4"/>
+            </w:tcBorders>
+          </w:tcPr>
+          <w:p>
+            <w:pPr>
+              <w:jc w:val="both"/>
+            </w:pPr>
+            <w:r>
+              <w:rPr>
+                <w:b/>
+                <w:color w:val="6B1818"/>
+                <w:sz w:val="20"/>
+              </w:rPr>
+              <w:t xml:space="preserve">Explicación práctica. </w:t>
+            </w:r>
+            <w:r>
+              <w:rPr>
+                <w:sz w:val="20"/>
+              </w:rPr>
+              <w:t>Tesis nueva detectada por el robot semanal. Revisa el texto completo en el SJF.</w:t>
+            </w:r>
+          </w:p>
+        </w:tc>
+      </w:tr>
+      <w:tr>
+        <w:tc>
+          <w:tcPr>
+            <w:tcW w:type="dxa" w:w="8787"/>
+            <w:tcBorders>
+              <w:top w:val="single" w:sz="4" w:color="D8D2C4"/>
+              <w:left w:val="single" w:sz="4" w:color="D8D2C4"/>
+              <w:bottom w:val="single" w:sz="4" w:color="D8D2C4"/>
+              <w:right w:val="single" w:sz="4" w:color="D8D2C4"/>
+            </w:tcBorders>
+          </w:tcPr>
+          <w:p>
+            <w:r>
+              <w:rPr>
+                <w:b/>
+                <w:color w:val="555555"/>
+                <w:sz w:val="18"/>
+              </w:rPr>
+              <w:t xml:space="preserve">Etiquetas: </w:t>
+            </w:r>
+            <w:r>
+              <w:rPr>
+                <w:color w:val="555555"/>
+                <w:sz w:val="18"/>
+              </w:rPr>
+              <w:t>#Responsabilidad administrativa de servidores públicos · #actualización automática</w:t>
+            </w:r>
+          </w:p>
+        </w:tc>
+      </w:tr>
+    </w:tbl>
+    <w:p/>
+    <w:p>
       <w:r>
         <w:rPr>
           <w:b/>
@@ -26757,6 +27069,540 @@
                 <w:sz w:val="18"/>
               </w:rPr>
               <w:t>#cuidado · #interés legítimo · #omisión legislativa · #perspectiva género</w:t>
+            </w:r>
+          </w:p>
+        </w:tc>
+      </w:tr>
+    </w:tbl>
+    <w:p/>
+    <w:p>
+      <w:pPr>
+        <w:ind w:left="170"/>
+      </w:pPr>
+      <w:r>
+        <w:rPr>
+          <w:b/>
+          <w:i/>
+          <w:color w:val="1A1A1A"/>
+          <w:sz w:val="24"/>
+        </w:rPr>
+        <w:t>› Perspectiva de género</w:t>
+      </w:r>
+    </w:p>
+    <w:tbl>
+      <w:tblPr>
+        <w:tblW w:type="auto" w:w="0"/>
+        <w:jc w:val="center"/>
+        <w:tblLayout w:type="fixed"/>
+        <w:tblLook w:firstColumn="1" w:firstRow="1" w:lastColumn="0" w:lastRow="0" w:noHBand="0" w:noVBand="1" w:val="04A0"/>
+      </w:tblPr>
+      <w:tblGrid>
+        <w:gridCol w:w="8787"/>
+      </w:tblGrid>
+      <w:tr>
+        <w:tc>
+          <w:tcPr>
+            <w:tcW w:type="dxa" w:w="8787"/>
+            <w:shd w:val="clear" w:color="auto" w:fill="F0E6D5"/>
+            <w:tcBorders>
+              <w:top w:val="single" w:sz="4" w:color="D8D2C4"/>
+              <w:left w:val="single" w:sz="4" w:color="D8D2C4"/>
+              <w:bottom w:val="single" w:sz="4" w:color="D8D2C4"/>
+              <w:right w:val="single" w:sz="4" w:color="D8D2C4"/>
+            </w:tcBorders>
+          </w:tcPr>
+          <w:p>
+            <w:pPr>
+              <w:spacing w:after="40"/>
+            </w:pPr>
+            <w:r>
+              <w:rPr>
+                <w:b/>
+                <w:color w:val="6B1818"/>
+                <w:sz w:val="18"/>
+              </w:rPr>
+              <w:t xml:space="preserve">[TESIS AISLADA]  </w:t>
+            </w:r>
+            <w:r>
+              <w:rPr>
+                <w:color w:val="555555"/>
+                <w:sz w:val="18"/>
+              </w:rPr>
+              <w:t>Tribunales Colegiados de Circuito  ·  Duodécima Época  ·  Federal</w:t>
+            </w:r>
+          </w:p>
+        </w:tc>
+      </w:tr>
+      <w:tr>
+        <w:tc>
+          <w:tcPr>
+            <w:tcW w:type="dxa" w:w="8787"/>
+            <w:tcBorders>
+              <w:top w:val="single" w:sz="4" w:color="D8D2C4"/>
+              <w:left w:val="single" w:sz="4" w:color="D8D2C4"/>
+              <w:bottom w:val="single" w:sz="4" w:color="D8D2C4"/>
+              <w:right w:val="single" w:sz="4" w:color="D8D2C4"/>
+            </w:tcBorders>
+          </w:tcPr>
+          <w:p>
+            <w:pPr>
+              <w:jc w:val="both"/>
+            </w:pPr>
+            <w:r>
+              <w:rPr>
+                <w:b/>
+                <w:color w:val="6B1818"/>
+                <w:sz w:val="22"/>
+              </w:rPr>
+              <w:t xml:space="preserve">Rubro. </w:t>
+            </w:r>
+            <w:r>
+              <w:rPr>
+                <w:b/>
+                <w:sz w:val="22"/>
+              </w:rPr>
+              <w:t>COMPENSACIÓN ECONÓMICA. ELEMENTOS MÍNIMOS QUE LA PERSONA JUZGADORA DEBE CONSIDERAR PARA MOTIVAR LA RESOLUCIÓN QUE LA CUANTIFICA, CON PERSPECTIVA DE GÉNERO.</w:t>
+            </w:r>
+          </w:p>
+        </w:tc>
+      </w:tr>
+      <w:tr>
+        <w:tc>
+          <w:tcPr>
+            <w:tcW w:type="dxa" w:w="8787"/>
+            <w:tcBorders>
+              <w:top w:val="single" w:sz="4" w:color="D8D2C4"/>
+              <w:left w:val="single" w:sz="4" w:color="D8D2C4"/>
+              <w:bottom w:val="single" w:sz="4" w:color="D8D2C4"/>
+              <w:right w:val="single" w:sz="4" w:color="D8D2C4"/>
+            </w:tcBorders>
+          </w:tcPr>
+          <w:p>
+            <w:r>
+              <w:rPr>
+                <w:i/>
+                <w:color w:val="555555"/>
+                <w:sz w:val="18"/>
+              </w:rPr>
+              <w:t>Subtema: Actualización automática semanal · Registro digital: 2032154 · Fecha: viernes 22 de mayo de 2026 10:27 h · Fuente: Semanario Judicial de la Federación — captura automática · Vigencia: vigente</w:t>
+            </w:r>
+          </w:p>
+        </w:tc>
+      </w:tr>
+      <w:tr>
+        <w:tc>
+          <w:tcPr>
+            <w:tcW w:type="dxa" w:w="8787"/>
+            <w:tcBorders>
+              <w:top w:val="single" w:sz="4" w:color="D8D2C4"/>
+              <w:left w:val="single" w:sz="4" w:color="D8D2C4"/>
+              <w:bottom w:val="single" w:sz="4" w:color="D8D2C4"/>
+              <w:right w:val="single" w:sz="4" w:color="D8D2C4"/>
+            </w:tcBorders>
+          </w:tcPr>
+          <w:p>
+            <w:r>
+              <w:rPr>
+                <w:b/>
+                <w:color w:val="6B1818"/>
+                <w:sz w:val="18"/>
+              </w:rPr>
+              <w:t xml:space="preserve">Consulta SJF/SCJN: </w:t>
+            </w:r>
+            <w:r>
+              <w:rPr>
+                <w:color w:val="6B1818"/>
+                <w:sz w:val="18"/>
+                <w:u w:val="single"/>
+              </w:rPr>
+              <w:t>https://sjf2.scjn.gob.mx/detalle/tesis/2032154</w:t>
+            </w:r>
+          </w:p>
+        </w:tc>
+      </w:tr>
+      <w:tr>
+        <w:tc>
+          <w:tcPr>
+            <w:tcW w:type="dxa" w:w="8787"/>
+            <w:tcBorders>
+              <w:top w:val="single" w:sz="4" w:color="D8D2C4"/>
+              <w:left w:val="single" w:sz="4" w:color="D8D2C4"/>
+              <w:bottom w:val="single" w:sz="4" w:color="D8D2C4"/>
+              <w:right w:val="single" w:sz="4" w:color="D8D2C4"/>
+            </w:tcBorders>
+          </w:tcPr>
+          <w:p>
+            <w:pPr>
+              <w:jc w:val="both"/>
+            </w:pPr>
+            <w:r>
+              <w:rPr>
+                <w:b/>
+                <w:color w:val="6B1818"/>
+                <w:sz w:val="20"/>
+              </w:rPr>
+              <w:t xml:space="preserve">Texto. </w:t>
+            </w:r>
+            <w:r>
+              <w:rPr>
+                <w:sz w:val="20"/>
+              </w:rPr>
+              <w:t>Criterio publicado esta semana en el Semanario Judicial de la Federación. Ver texto íntegro en el SJF mediante el enlace directo.</w:t>
+            </w:r>
+          </w:p>
+        </w:tc>
+      </w:tr>
+      <w:tr>
+        <w:tc>
+          <w:tcPr>
+            <w:tcW w:type="dxa" w:w="8787"/>
+            <w:tcBorders>
+              <w:top w:val="single" w:sz="4" w:color="D8D2C4"/>
+              <w:left w:val="single" w:sz="4" w:color="D8D2C4"/>
+              <w:bottom w:val="single" w:sz="4" w:color="D8D2C4"/>
+              <w:right w:val="single" w:sz="4" w:color="D8D2C4"/>
+            </w:tcBorders>
+          </w:tcPr>
+          <w:p>
+            <w:pPr>
+              <w:jc w:val="both"/>
+            </w:pPr>
+            <w:r>
+              <w:rPr>
+                <w:b/>
+                <w:color w:val="6B1818"/>
+                <w:sz w:val="20"/>
+              </w:rPr>
+              <w:t xml:space="preserve">Trascendencia. </w:t>
+            </w:r>
+            <w:r>
+              <w:rPr>
+                <w:i/>
+                <w:sz w:val="20"/>
+              </w:rPr>
+              <w:t>Incorporada automáticamente en la actualización semanal. Pendiente de análisis editorial.</w:t>
+            </w:r>
+          </w:p>
+        </w:tc>
+      </w:tr>
+      <w:tr>
+        <w:tc>
+          <w:tcPr>
+            <w:tcW w:type="dxa" w:w="8787"/>
+            <w:tcBorders>
+              <w:top w:val="single" w:sz="4" w:color="D8D2C4"/>
+              <w:left w:val="single" w:sz="4" w:color="D8D2C4"/>
+              <w:bottom w:val="single" w:sz="4" w:color="D8D2C4"/>
+              <w:right w:val="single" w:sz="4" w:color="D8D2C4"/>
+            </w:tcBorders>
+          </w:tcPr>
+          <w:p>
+            <w:pPr>
+              <w:jc w:val="both"/>
+            </w:pPr>
+            <w:r>
+              <w:rPr>
+                <w:b/>
+                <w:color w:val="6B1818"/>
+                <w:sz w:val="20"/>
+              </w:rPr>
+              <w:t xml:space="preserve">Explicación práctica. </w:t>
+            </w:r>
+            <w:r>
+              <w:rPr>
+                <w:sz w:val="20"/>
+              </w:rPr>
+              <w:t>Tesis nueva detectada por el robot semanal. Revisa el texto completo en el SJF.</w:t>
+            </w:r>
+          </w:p>
+        </w:tc>
+      </w:tr>
+      <w:tr>
+        <w:tc>
+          <w:tcPr>
+            <w:tcW w:type="dxa" w:w="8787"/>
+            <w:tcBorders>
+              <w:top w:val="single" w:sz="4" w:color="D8D2C4"/>
+              <w:left w:val="single" w:sz="4" w:color="D8D2C4"/>
+              <w:bottom w:val="single" w:sz="4" w:color="D8D2C4"/>
+              <w:right w:val="single" w:sz="4" w:color="D8D2C4"/>
+            </w:tcBorders>
+          </w:tcPr>
+          <w:p>
+            <w:r>
+              <w:rPr>
+                <w:b/>
+                <w:color w:val="555555"/>
+                <w:sz w:val="18"/>
+              </w:rPr>
+              <w:t xml:space="preserve">Etiquetas: </w:t>
+            </w:r>
+            <w:r>
+              <w:rPr>
+                <w:color w:val="555555"/>
+                <w:sz w:val="18"/>
+              </w:rPr>
+              <w:t>#Perspectiva de género · #actualización automática</w:t>
+            </w:r>
+          </w:p>
+        </w:tc>
+      </w:tr>
+    </w:tbl>
+    <w:p/>
+    <w:tbl>
+      <w:tblPr>
+        <w:tblW w:type="auto" w:w="0"/>
+        <w:jc w:val="center"/>
+        <w:tblLayout w:type="fixed"/>
+        <w:tblLook w:firstColumn="1" w:firstRow="1" w:lastColumn="0" w:lastRow="0" w:noHBand="0" w:noVBand="1" w:val="04A0"/>
+      </w:tblPr>
+      <w:tblGrid>
+        <w:gridCol w:w="8787"/>
+      </w:tblGrid>
+      <w:tr>
+        <w:tc>
+          <w:tcPr>
+            <w:tcW w:type="dxa" w:w="8787"/>
+            <w:shd w:val="clear" w:color="auto" w:fill="F0E6D5"/>
+            <w:tcBorders>
+              <w:top w:val="single" w:sz="4" w:color="D8D2C4"/>
+              <w:left w:val="single" w:sz="4" w:color="D8D2C4"/>
+              <w:bottom w:val="single" w:sz="4" w:color="D8D2C4"/>
+              <w:right w:val="single" w:sz="4" w:color="D8D2C4"/>
+            </w:tcBorders>
+          </w:tcPr>
+          <w:p>
+            <w:pPr>
+              <w:spacing w:after="40"/>
+            </w:pPr>
+            <w:r>
+              <w:rPr>
+                <w:b/>
+                <w:color w:val="6B1818"/>
+                <w:sz w:val="18"/>
+              </w:rPr>
+              <w:t xml:space="preserve">[TESIS AISLADA]  </w:t>
+            </w:r>
+            <w:r>
+              <w:rPr>
+                <w:color w:val="555555"/>
+                <w:sz w:val="18"/>
+              </w:rPr>
+              <w:t>Tribunales Colegiados de Circuito  ·  Duodécima Época  ·  Federal</w:t>
+            </w:r>
+          </w:p>
+        </w:tc>
+      </w:tr>
+      <w:tr>
+        <w:tc>
+          <w:tcPr>
+            <w:tcW w:type="dxa" w:w="8787"/>
+            <w:tcBorders>
+              <w:top w:val="single" w:sz="4" w:color="D8D2C4"/>
+              <w:left w:val="single" w:sz="4" w:color="D8D2C4"/>
+              <w:bottom w:val="single" w:sz="4" w:color="D8D2C4"/>
+              <w:right w:val="single" w:sz="4" w:color="D8D2C4"/>
+            </w:tcBorders>
+          </w:tcPr>
+          <w:p>
+            <w:pPr>
+              <w:jc w:val="both"/>
+            </w:pPr>
+            <w:r>
+              <w:rPr>
+                <w:b/>
+                <w:color w:val="6B1818"/>
+                <w:sz w:val="22"/>
+              </w:rPr>
+              <w:t xml:space="preserve">Rubro. </w:t>
+            </w:r>
+            <w:r>
+              <w:rPr>
+                <w:b/>
+                <w:sz w:val="22"/>
+              </w:rPr>
+              <w:t>VIOLENCIA FAMILIAR. CUANDO LA VÍCTIMA SEA UNA PERSONA MENOR DE EDAD Y SE ALEGUE ALIENACIÓN O MANIPULACIÓN PARENTAL, EL ÓRGANO JURISDICCIONAL DEBE ORDENAR LA PRÁCTICA DE PRUEBAS PERICIALES PARA VERIFICAR SI SE ACTUALIZA DICHA CONDICIÓN.</w:t>
+            </w:r>
+          </w:p>
+        </w:tc>
+      </w:tr>
+      <w:tr>
+        <w:tc>
+          <w:tcPr>
+            <w:tcW w:type="dxa" w:w="8787"/>
+            <w:tcBorders>
+              <w:top w:val="single" w:sz="4" w:color="D8D2C4"/>
+              <w:left w:val="single" w:sz="4" w:color="D8D2C4"/>
+              <w:bottom w:val="single" w:sz="4" w:color="D8D2C4"/>
+              <w:right w:val="single" w:sz="4" w:color="D8D2C4"/>
+            </w:tcBorders>
+          </w:tcPr>
+          <w:p>
+            <w:r>
+              <w:rPr>
+                <w:i/>
+                <w:color w:val="555555"/>
+                <w:sz w:val="18"/>
+              </w:rPr>
+              <w:t>Subtema: Actualización automática semanal · Registro digital: 2032184 · Fecha: viernes 22 de mayo de 2026 10:27 h · Fuente: Semanario Judicial de la Federación — captura automática · Vigencia: vigente</w:t>
+            </w:r>
+          </w:p>
+        </w:tc>
+      </w:tr>
+      <w:tr>
+        <w:tc>
+          <w:tcPr>
+            <w:tcW w:type="dxa" w:w="8787"/>
+            <w:tcBorders>
+              <w:top w:val="single" w:sz="4" w:color="D8D2C4"/>
+              <w:left w:val="single" w:sz="4" w:color="D8D2C4"/>
+              <w:bottom w:val="single" w:sz="4" w:color="D8D2C4"/>
+              <w:right w:val="single" w:sz="4" w:color="D8D2C4"/>
+            </w:tcBorders>
+          </w:tcPr>
+          <w:p>
+            <w:r>
+              <w:rPr>
+                <w:b/>
+                <w:color w:val="6B1818"/>
+                <w:sz w:val="18"/>
+              </w:rPr>
+              <w:t xml:space="preserve">Consulta SJF/SCJN: </w:t>
+            </w:r>
+            <w:r>
+              <w:rPr>
+                <w:color w:val="6B1818"/>
+                <w:sz w:val="18"/>
+                <w:u w:val="single"/>
+              </w:rPr>
+              <w:t>https://sjf2.scjn.gob.mx/detalle/tesis/2032184</w:t>
+            </w:r>
+          </w:p>
+        </w:tc>
+      </w:tr>
+      <w:tr>
+        <w:tc>
+          <w:tcPr>
+            <w:tcW w:type="dxa" w:w="8787"/>
+            <w:tcBorders>
+              <w:top w:val="single" w:sz="4" w:color="D8D2C4"/>
+              <w:left w:val="single" w:sz="4" w:color="D8D2C4"/>
+              <w:bottom w:val="single" w:sz="4" w:color="D8D2C4"/>
+              <w:right w:val="single" w:sz="4" w:color="D8D2C4"/>
+            </w:tcBorders>
+          </w:tcPr>
+          <w:p>
+            <w:pPr>
+              <w:jc w:val="both"/>
+            </w:pPr>
+            <w:r>
+              <w:rPr>
+                <w:b/>
+                <w:color w:val="6B1818"/>
+                <w:sz w:val="20"/>
+              </w:rPr>
+              <w:t xml:space="preserve">Texto. </w:t>
+            </w:r>
+            <w:r>
+              <w:rPr>
+                <w:sz w:val="20"/>
+              </w:rPr>
+              <w:t>Criterio publicado esta semana en el Semanario Judicial de la Federación. Ver texto íntegro en el SJF mediante el enlace directo.</w:t>
+            </w:r>
+          </w:p>
+        </w:tc>
+      </w:tr>
+      <w:tr>
+        <w:tc>
+          <w:tcPr>
+            <w:tcW w:type="dxa" w:w="8787"/>
+            <w:tcBorders>
+              <w:top w:val="single" w:sz="4" w:color="D8D2C4"/>
+              <w:left w:val="single" w:sz="4" w:color="D8D2C4"/>
+              <w:bottom w:val="single" w:sz="4" w:color="D8D2C4"/>
+              <w:right w:val="single" w:sz="4" w:color="D8D2C4"/>
+            </w:tcBorders>
+          </w:tcPr>
+          <w:p>
+            <w:pPr>
+              <w:jc w:val="both"/>
+            </w:pPr>
+            <w:r>
+              <w:rPr>
+                <w:b/>
+                <w:color w:val="6B1818"/>
+                <w:sz w:val="20"/>
+              </w:rPr>
+              <w:t xml:space="preserve">Trascendencia. </w:t>
+            </w:r>
+            <w:r>
+              <w:rPr>
+                <w:i/>
+                <w:sz w:val="20"/>
+              </w:rPr>
+              <w:t>Incorporada automáticamente en la actualización semanal. Pendiente de análisis editorial.</w:t>
+            </w:r>
+          </w:p>
+        </w:tc>
+      </w:tr>
+      <w:tr>
+        <w:tc>
+          <w:tcPr>
+            <w:tcW w:type="dxa" w:w="8787"/>
+            <w:tcBorders>
+              <w:top w:val="single" w:sz="4" w:color="D8D2C4"/>
+              <w:left w:val="single" w:sz="4" w:color="D8D2C4"/>
+              <w:bottom w:val="single" w:sz="4" w:color="D8D2C4"/>
+              <w:right w:val="single" w:sz="4" w:color="D8D2C4"/>
+            </w:tcBorders>
+          </w:tcPr>
+          <w:p>
+            <w:pPr>
+              <w:jc w:val="both"/>
+            </w:pPr>
+            <w:r>
+              <w:rPr>
+                <w:b/>
+                <w:color w:val="6B1818"/>
+                <w:sz w:val="20"/>
+              </w:rPr>
+              <w:t xml:space="preserve">Explicación práctica. </w:t>
+            </w:r>
+            <w:r>
+              <w:rPr>
+                <w:sz w:val="20"/>
+              </w:rPr>
+              <w:t>Tesis nueva detectada por el robot semanal. Revisa el texto completo en el SJF.</w:t>
+            </w:r>
+          </w:p>
+        </w:tc>
+      </w:tr>
+      <w:tr>
+        <w:tc>
+          <w:tcPr>
+            <w:tcW w:type="dxa" w:w="8787"/>
+            <w:tcBorders>
+              <w:top w:val="single" w:sz="4" w:color="D8D2C4"/>
+              <w:left w:val="single" w:sz="4" w:color="D8D2C4"/>
+              <w:bottom w:val="single" w:sz="4" w:color="D8D2C4"/>
+              <w:right w:val="single" w:sz="4" w:color="D8D2C4"/>
+            </w:tcBorders>
+          </w:tcPr>
+          <w:p>
+            <w:r>
+              <w:rPr>
+                <w:b/>
+                <w:color w:val="555555"/>
+                <w:sz w:val="18"/>
+              </w:rPr>
+              <w:t xml:space="preserve">Etiquetas: </w:t>
+            </w:r>
+            <w:r>
+              <w:rPr>
+                <w:color w:val="555555"/>
+                <w:sz w:val="18"/>
+              </w:rPr>
+              <w:t>#Perspectiva de género · #actualización automática</w:t>
             </w:r>
           </w:p>
         </w:tc>

</xml_diff>

<commit_message>
Actualizacion semanal automatica 2026-05-30
</commit_message>
<xml_diff>
--- a/Acervo_Jurisprudencial.docx
+++ b/Acervo_Jurisprudencial.docx
@@ -1353,6 +1353,44 @@
           <w:b/>
           <w:sz w:val="22"/>
         </w:rPr>
+        <w:t xml:space="preserve">   · Amparo</w:t>
+      </w:r>
+      <w:r>
+        <w:rPr>
+          <w:color w:val="555555"/>
+          <w:sz w:val="20"/>
+        </w:rPr>
+        <w:t xml:space="preserve">  (1)</w:t>
+      </w:r>
+    </w:p>
+    <w:p>
+      <w:pPr>
+        <w:ind w:left="794"/>
+      </w:pPr>
+      <w:r>
+        <w:rPr>
+          <w:color w:val="555555"/>
+          <w:sz w:val="20"/>
+        </w:rPr>
+        <w:t xml:space="preserve">      › Suspensión</w:t>
+      </w:r>
+      <w:r>
+        <w:rPr>
+          <w:color w:val="555555"/>
+          <w:sz w:val="18"/>
+        </w:rPr>
+        <w:t xml:space="preserve">  [1]</w:t>
+      </w:r>
+    </w:p>
+    <w:p>
+      <w:pPr>
+        <w:ind w:left="340"/>
+      </w:pPr>
+      <w:r>
+        <w:rPr>
+          <w:b/>
+          <w:sz w:val="22"/>
+        </w:rPr>
         <w:t xml:space="preserve">   · Penal</w:t>
       </w:r>
       <w:r>
@@ -1922,7 +1960,7 @@
           <w:color w:val="555555"/>
           <w:sz w:val="20"/>
         </w:rPr>
-        <w:t xml:space="preserve">  (5)</w:t>
+        <w:t xml:space="preserve">  (6)</w:t>
       </w:r>
     </w:p>
     <w:p>
@@ -1960,7 +1998,7 @@
           <w:color w:val="555555"/>
           <w:sz w:val="18"/>
         </w:rPr>
-        <w:t xml:space="preserve">  [2]</w:t>
+        <w:t xml:space="preserve">  [3]</w:t>
       </w:r>
     </w:p>
     <w:p>
@@ -2051,7 +2089,7 @@
           <w:color w:val="555555"/>
           <w:sz w:val="22"/>
         </w:rPr>
-        <w:t>Total de entradas: 110</w:t>
+        <w:t>Total de entradas: 112</w:t>
       </w:r>
     </w:p>
     <w:p>
@@ -19499,6 +19537,290 @@
           <w:color w:val="6B1818"/>
           <w:sz w:val="28"/>
         </w:rPr>
+        <w:t>Materia: Amparo</w:t>
+      </w:r>
+    </w:p>
+    <w:p>
+      <w:pPr>
+        <w:ind w:left="170"/>
+      </w:pPr>
+      <w:r>
+        <w:rPr>
+          <w:b/>
+          <w:i/>
+          <w:color w:val="1A1A1A"/>
+          <w:sz w:val="24"/>
+        </w:rPr>
+        <w:t>› Suspensión</w:t>
+      </w:r>
+    </w:p>
+    <w:tbl>
+      <w:tblPr>
+        <w:tblW w:type="auto" w:w="0"/>
+        <w:jc w:val="center"/>
+        <w:tblLayout w:type="fixed"/>
+        <w:tblLook w:firstColumn="1" w:firstRow="1" w:lastColumn="0" w:lastRow="0" w:noHBand="0" w:noVBand="1" w:val="04A0"/>
+      </w:tblPr>
+      <w:tblGrid>
+        <w:gridCol w:w="8787"/>
+      </w:tblGrid>
+      <w:tr>
+        <w:tc>
+          <w:tcPr>
+            <w:tcW w:type="dxa" w:w="8787"/>
+            <w:shd w:val="clear" w:color="auto" w:fill="F0E6D5"/>
+            <w:tcBorders>
+              <w:top w:val="single" w:sz="4" w:color="D8D2C4"/>
+              <w:left w:val="single" w:sz="4" w:color="D8D2C4"/>
+              <w:bottom w:val="single" w:sz="4" w:color="D8D2C4"/>
+              <w:right w:val="single" w:sz="4" w:color="D8D2C4"/>
+            </w:tcBorders>
+          </w:tcPr>
+          <w:p>
+            <w:pPr>
+              <w:spacing w:after="40"/>
+            </w:pPr>
+            <w:r>
+              <w:rPr>
+                <w:b/>
+                <w:color w:val="6B1818"/>
+                <w:sz w:val="18"/>
+              </w:rPr>
+              <w:t xml:space="preserve">[JURISPRUDENCIA]  </w:t>
+            </w:r>
+            <w:r>
+              <w:rPr>
+                <w:color w:val="555555"/>
+                <w:sz w:val="18"/>
+              </w:rPr>
+              <w:t>Plenos Regionales  ·  Duodécima Época  ·  Federal</w:t>
+            </w:r>
+          </w:p>
+        </w:tc>
+      </w:tr>
+      <w:tr>
+        <w:tc>
+          <w:tcPr>
+            <w:tcW w:type="dxa" w:w="8787"/>
+            <w:tcBorders>
+              <w:top w:val="single" w:sz="4" w:color="D8D2C4"/>
+              <w:left w:val="single" w:sz="4" w:color="D8D2C4"/>
+              <w:bottom w:val="single" w:sz="4" w:color="D8D2C4"/>
+              <w:right w:val="single" w:sz="4" w:color="D8D2C4"/>
+            </w:tcBorders>
+          </w:tcPr>
+          <w:p>
+            <w:pPr>
+              <w:jc w:val="both"/>
+            </w:pPr>
+            <w:r>
+              <w:rPr>
+                <w:b/>
+                <w:color w:val="6B1818"/>
+                <w:sz w:val="22"/>
+              </w:rPr>
+              <w:t xml:space="preserve">Rubro. </w:t>
+            </w:r>
+            <w:r>
+              <w:rPr>
+                <w:b/>
+                <w:sz w:val="22"/>
+              </w:rPr>
+              <w:t>SUSPENSIÓN PROVISIONAL CON EFECTOS RESTITUTORIOS. ES IMPROCEDENTE CONTRA LA NEGATIVA MATERIAL A RECIBIR UNA SOLICITUD DE BASIFICACIÓN LABORAL, PORQUE SU CONCESIÓN IMPLICA UN BENEFICIO TOTAL QUE DEJA SIN MATERIA EL JUICIO DE AMPARO.</w:t>
+            </w:r>
+          </w:p>
+        </w:tc>
+      </w:tr>
+      <w:tr>
+        <w:tc>
+          <w:tcPr>
+            <w:tcW w:type="dxa" w:w="8787"/>
+            <w:tcBorders>
+              <w:top w:val="single" w:sz="4" w:color="D8D2C4"/>
+              <w:left w:val="single" w:sz="4" w:color="D8D2C4"/>
+              <w:bottom w:val="single" w:sz="4" w:color="D8D2C4"/>
+              <w:right w:val="single" w:sz="4" w:color="D8D2C4"/>
+            </w:tcBorders>
+          </w:tcPr>
+          <w:p>
+            <w:r>
+              <w:rPr>
+                <w:i/>
+                <w:color w:val="555555"/>
+                <w:sz w:val="18"/>
+              </w:rPr>
+              <w:t>Subtema: Actualización automática semanal · Registro digital: 2032212 · Fecha: viernes 29 de mayo de 2026 10:34 h · Fuente: Semanario Judicial de la Federación — captura automática · Vigencia: vigente</w:t>
+            </w:r>
+          </w:p>
+        </w:tc>
+      </w:tr>
+      <w:tr>
+        <w:tc>
+          <w:tcPr>
+            <w:tcW w:type="dxa" w:w="8787"/>
+            <w:tcBorders>
+              <w:top w:val="single" w:sz="4" w:color="D8D2C4"/>
+              <w:left w:val="single" w:sz="4" w:color="D8D2C4"/>
+              <w:bottom w:val="single" w:sz="4" w:color="D8D2C4"/>
+              <w:right w:val="single" w:sz="4" w:color="D8D2C4"/>
+            </w:tcBorders>
+          </w:tcPr>
+          <w:p>
+            <w:r>
+              <w:rPr>
+                <w:b/>
+                <w:color w:val="6B1818"/>
+                <w:sz w:val="18"/>
+              </w:rPr>
+              <w:t xml:space="preserve">Consulta SJF/SCJN: </w:t>
+            </w:r>
+            <w:r>
+              <w:rPr>
+                <w:color w:val="6B1818"/>
+                <w:sz w:val="18"/>
+                <w:u w:val="single"/>
+              </w:rPr>
+              <w:t>https://sjf2.scjn.gob.mx/detalle/tesis/2032212</w:t>
+            </w:r>
+          </w:p>
+        </w:tc>
+      </w:tr>
+      <w:tr>
+        <w:tc>
+          <w:tcPr>
+            <w:tcW w:type="dxa" w:w="8787"/>
+            <w:tcBorders>
+              <w:top w:val="single" w:sz="4" w:color="D8D2C4"/>
+              <w:left w:val="single" w:sz="4" w:color="D8D2C4"/>
+              <w:bottom w:val="single" w:sz="4" w:color="D8D2C4"/>
+              <w:right w:val="single" w:sz="4" w:color="D8D2C4"/>
+            </w:tcBorders>
+          </w:tcPr>
+          <w:p>
+            <w:pPr>
+              <w:jc w:val="both"/>
+            </w:pPr>
+            <w:r>
+              <w:rPr>
+                <w:b/>
+                <w:color w:val="6B1818"/>
+                <w:sz w:val="20"/>
+              </w:rPr>
+              <w:t xml:space="preserve">Texto. </w:t>
+            </w:r>
+            <w:r>
+              <w:rPr>
+                <w:sz w:val="20"/>
+              </w:rPr>
+              <w:t>Criterio publicado esta semana en el Semanario Judicial de la Federación. Ver texto íntegro en el SJF mediante el enlace directo.</w:t>
+            </w:r>
+          </w:p>
+        </w:tc>
+      </w:tr>
+      <w:tr>
+        <w:tc>
+          <w:tcPr>
+            <w:tcW w:type="dxa" w:w="8787"/>
+            <w:tcBorders>
+              <w:top w:val="single" w:sz="4" w:color="D8D2C4"/>
+              <w:left w:val="single" w:sz="4" w:color="D8D2C4"/>
+              <w:bottom w:val="single" w:sz="4" w:color="D8D2C4"/>
+              <w:right w:val="single" w:sz="4" w:color="D8D2C4"/>
+            </w:tcBorders>
+          </w:tcPr>
+          <w:p>
+            <w:pPr>
+              <w:jc w:val="both"/>
+            </w:pPr>
+            <w:r>
+              <w:rPr>
+                <w:b/>
+                <w:color w:val="6B1818"/>
+                <w:sz w:val="20"/>
+              </w:rPr>
+              <w:t xml:space="preserve">Trascendencia. </w:t>
+            </w:r>
+            <w:r>
+              <w:rPr>
+                <w:i/>
+                <w:sz w:val="20"/>
+              </w:rPr>
+              <w:t>Incorporada automáticamente en la actualización semanal. Pendiente de análisis editorial.</w:t>
+            </w:r>
+          </w:p>
+        </w:tc>
+      </w:tr>
+      <w:tr>
+        <w:tc>
+          <w:tcPr>
+            <w:tcW w:type="dxa" w:w="8787"/>
+            <w:tcBorders>
+              <w:top w:val="single" w:sz="4" w:color="D8D2C4"/>
+              <w:left w:val="single" w:sz="4" w:color="D8D2C4"/>
+              <w:bottom w:val="single" w:sz="4" w:color="D8D2C4"/>
+              <w:right w:val="single" w:sz="4" w:color="D8D2C4"/>
+            </w:tcBorders>
+          </w:tcPr>
+          <w:p>
+            <w:pPr>
+              <w:jc w:val="both"/>
+            </w:pPr>
+            <w:r>
+              <w:rPr>
+                <w:b/>
+                <w:color w:val="6B1818"/>
+                <w:sz w:val="20"/>
+              </w:rPr>
+              <w:t xml:space="preserve">Explicación práctica. </w:t>
+            </w:r>
+            <w:r>
+              <w:rPr>
+                <w:sz w:val="20"/>
+              </w:rPr>
+              <w:t>Tesis nueva detectada por el robot semanal. Revisa el texto completo en el SJF.</w:t>
+            </w:r>
+          </w:p>
+        </w:tc>
+      </w:tr>
+      <w:tr>
+        <w:tc>
+          <w:tcPr>
+            <w:tcW w:type="dxa" w:w="8787"/>
+            <w:tcBorders>
+              <w:top w:val="single" w:sz="4" w:color="D8D2C4"/>
+              <w:left w:val="single" w:sz="4" w:color="D8D2C4"/>
+              <w:bottom w:val="single" w:sz="4" w:color="D8D2C4"/>
+              <w:right w:val="single" w:sz="4" w:color="D8D2C4"/>
+            </w:tcBorders>
+          </w:tcPr>
+          <w:p>
+            <w:r>
+              <w:rPr>
+                <w:b/>
+                <w:color w:val="555555"/>
+                <w:sz w:val="18"/>
+              </w:rPr>
+              <w:t xml:space="preserve">Etiquetas: </w:t>
+            </w:r>
+            <w:r>
+              <w:rPr>
+                <w:color w:val="555555"/>
+                <w:sz w:val="18"/>
+              </w:rPr>
+              <w:t>#Suspensión · #actualización automática</w:t>
+            </w:r>
+          </w:p>
+        </w:tc>
+      </w:tr>
+    </w:tbl>
+    <w:p/>
+    <w:p>
+      <w:r>
+        <w:rPr>
+          <w:b/>
+          <w:color w:val="6B1818"/>
+          <w:sz w:val="28"/>
+        </w:rPr>
         <w:t>Materia: Penal</w:t>
       </w:r>
     </w:p>
@@ -29803,6 +30125,266 @@
         <w:t>› Juicio ejecutivo mercantil</w:t>
       </w:r>
     </w:p>
+    <w:tbl>
+      <w:tblPr>
+        <w:tblW w:type="auto" w:w="0"/>
+        <w:jc w:val="center"/>
+        <w:tblLayout w:type="fixed"/>
+        <w:tblLook w:firstColumn="1" w:firstRow="1" w:lastColumn="0" w:lastRow="0" w:noHBand="0" w:noVBand="1" w:val="04A0"/>
+      </w:tblPr>
+      <w:tblGrid>
+        <w:gridCol w:w="8787"/>
+      </w:tblGrid>
+      <w:tr>
+        <w:tc>
+          <w:tcPr>
+            <w:tcW w:type="dxa" w:w="8787"/>
+            <w:shd w:val="clear" w:color="auto" w:fill="F0E6D5"/>
+            <w:tcBorders>
+              <w:top w:val="single" w:sz="4" w:color="D8D2C4"/>
+              <w:left w:val="single" w:sz="4" w:color="D8D2C4"/>
+              <w:bottom w:val="single" w:sz="4" w:color="D8D2C4"/>
+              <w:right w:val="single" w:sz="4" w:color="D8D2C4"/>
+            </w:tcBorders>
+          </w:tcPr>
+          <w:p>
+            <w:pPr>
+              <w:spacing w:after="40"/>
+            </w:pPr>
+            <w:r>
+              <w:rPr>
+                <w:b/>
+                <w:color w:val="6B1818"/>
+                <w:sz w:val="18"/>
+              </w:rPr>
+              <w:t xml:space="preserve">[TESIS AISLADA]  </w:t>
+            </w:r>
+            <w:r>
+              <w:rPr>
+                <w:color w:val="555555"/>
+                <w:sz w:val="18"/>
+              </w:rPr>
+              <w:t>Tribunales Colegiados de Circuito  ·  Duodécima Época  ·  Federal</w:t>
+            </w:r>
+          </w:p>
+        </w:tc>
+      </w:tr>
+      <w:tr>
+        <w:tc>
+          <w:tcPr>
+            <w:tcW w:type="dxa" w:w="8787"/>
+            <w:tcBorders>
+              <w:top w:val="single" w:sz="4" w:color="D8D2C4"/>
+              <w:left w:val="single" w:sz="4" w:color="D8D2C4"/>
+              <w:bottom w:val="single" w:sz="4" w:color="D8D2C4"/>
+              <w:right w:val="single" w:sz="4" w:color="D8D2C4"/>
+            </w:tcBorders>
+          </w:tcPr>
+          <w:p>
+            <w:pPr>
+              <w:jc w:val="both"/>
+            </w:pPr>
+            <w:r>
+              <w:rPr>
+                <w:b/>
+                <w:color w:val="6B1818"/>
+                <w:sz w:val="22"/>
+              </w:rPr>
+              <w:t xml:space="preserve">Rubro. </w:t>
+            </w:r>
+            <w:r>
+              <w:rPr>
+                <w:b/>
+                <w:sz w:val="22"/>
+              </w:rPr>
+              <w:t>GARANTÍA PARA QUE SIGA SURTIENDO EFECTOS LA SUSPENSIÓN EN AMPARO INDIRECTO. ES EXIGIBLE A LA PERSONA MORAL PRIVADA DECLARADA EN QUIEBRA, AL NO ACTUALIZARSE ALGÚN SUPUESTO LEGAL PARA EXENTAR SU EXHIBICIÓN.</w:t>
+            </w:r>
+          </w:p>
+        </w:tc>
+      </w:tr>
+      <w:tr>
+        <w:tc>
+          <w:tcPr>
+            <w:tcW w:type="dxa" w:w="8787"/>
+            <w:tcBorders>
+              <w:top w:val="single" w:sz="4" w:color="D8D2C4"/>
+              <w:left w:val="single" w:sz="4" w:color="D8D2C4"/>
+              <w:bottom w:val="single" w:sz="4" w:color="D8D2C4"/>
+              <w:right w:val="single" w:sz="4" w:color="D8D2C4"/>
+            </w:tcBorders>
+          </w:tcPr>
+          <w:p>
+            <w:r>
+              <w:rPr>
+                <w:i/>
+                <w:color w:val="555555"/>
+                <w:sz w:val="18"/>
+              </w:rPr>
+              <w:t>Subtema: Actualización automática semanal · Registro digital: 2032198 · Fecha: viernes 29 de mayo de 2026 10:34 h · Fuente: Semanario Judicial de la Federación — captura automática · Vigencia: vigente</w:t>
+            </w:r>
+          </w:p>
+        </w:tc>
+      </w:tr>
+      <w:tr>
+        <w:tc>
+          <w:tcPr>
+            <w:tcW w:type="dxa" w:w="8787"/>
+            <w:tcBorders>
+              <w:top w:val="single" w:sz="4" w:color="D8D2C4"/>
+              <w:left w:val="single" w:sz="4" w:color="D8D2C4"/>
+              <w:bottom w:val="single" w:sz="4" w:color="D8D2C4"/>
+              <w:right w:val="single" w:sz="4" w:color="D8D2C4"/>
+            </w:tcBorders>
+          </w:tcPr>
+          <w:p>
+            <w:r>
+              <w:rPr>
+                <w:b/>
+                <w:color w:val="6B1818"/>
+                <w:sz w:val="18"/>
+              </w:rPr>
+              <w:t xml:space="preserve">Consulta SJF/SCJN: </w:t>
+            </w:r>
+            <w:r>
+              <w:rPr>
+                <w:color w:val="6B1818"/>
+                <w:sz w:val="18"/>
+                <w:u w:val="single"/>
+              </w:rPr>
+              <w:t>https://sjf2.scjn.gob.mx/detalle/tesis/2032198</w:t>
+            </w:r>
+          </w:p>
+        </w:tc>
+      </w:tr>
+      <w:tr>
+        <w:tc>
+          <w:tcPr>
+            <w:tcW w:type="dxa" w:w="8787"/>
+            <w:tcBorders>
+              <w:top w:val="single" w:sz="4" w:color="D8D2C4"/>
+              <w:left w:val="single" w:sz="4" w:color="D8D2C4"/>
+              <w:bottom w:val="single" w:sz="4" w:color="D8D2C4"/>
+              <w:right w:val="single" w:sz="4" w:color="D8D2C4"/>
+            </w:tcBorders>
+          </w:tcPr>
+          <w:p>
+            <w:pPr>
+              <w:jc w:val="both"/>
+            </w:pPr>
+            <w:r>
+              <w:rPr>
+                <w:b/>
+                <w:color w:val="6B1818"/>
+                <w:sz w:val="20"/>
+              </w:rPr>
+              <w:t xml:space="preserve">Texto. </w:t>
+            </w:r>
+            <w:r>
+              <w:rPr>
+                <w:sz w:val="20"/>
+              </w:rPr>
+              <w:t>Criterio publicado esta semana en el Semanario Judicial de la Federación. Ver texto íntegro en el SJF mediante el enlace directo.</w:t>
+            </w:r>
+          </w:p>
+        </w:tc>
+      </w:tr>
+      <w:tr>
+        <w:tc>
+          <w:tcPr>
+            <w:tcW w:type="dxa" w:w="8787"/>
+            <w:tcBorders>
+              <w:top w:val="single" w:sz="4" w:color="D8D2C4"/>
+              <w:left w:val="single" w:sz="4" w:color="D8D2C4"/>
+              <w:bottom w:val="single" w:sz="4" w:color="D8D2C4"/>
+              <w:right w:val="single" w:sz="4" w:color="D8D2C4"/>
+            </w:tcBorders>
+          </w:tcPr>
+          <w:p>
+            <w:pPr>
+              <w:jc w:val="both"/>
+            </w:pPr>
+            <w:r>
+              <w:rPr>
+                <w:b/>
+                <w:color w:val="6B1818"/>
+                <w:sz w:val="20"/>
+              </w:rPr>
+              <w:t xml:space="preserve">Trascendencia. </w:t>
+            </w:r>
+            <w:r>
+              <w:rPr>
+                <w:i/>
+                <w:sz w:val="20"/>
+              </w:rPr>
+              <w:t>Incorporada automáticamente en la actualización semanal. Pendiente de análisis editorial.</w:t>
+            </w:r>
+          </w:p>
+        </w:tc>
+      </w:tr>
+      <w:tr>
+        <w:tc>
+          <w:tcPr>
+            <w:tcW w:type="dxa" w:w="8787"/>
+            <w:tcBorders>
+              <w:top w:val="single" w:sz="4" w:color="D8D2C4"/>
+              <w:left w:val="single" w:sz="4" w:color="D8D2C4"/>
+              <w:bottom w:val="single" w:sz="4" w:color="D8D2C4"/>
+              <w:right w:val="single" w:sz="4" w:color="D8D2C4"/>
+            </w:tcBorders>
+          </w:tcPr>
+          <w:p>
+            <w:pPr>
+              <w:jc w:val="both"/>
+            </w:pPr>
+            <w:r>
+              <w:rPr>
+                <w:b/>
+                <w:color w:val="6B1818"/>
+                <w:sz w:val="20"/>
+              </w:rPr>
+              <w:t xml:space="preserve">Explicación práctica. </w:t>
+            </w:r>
+            <w:r>
+              <w:rPr>
+                <w:sz w:val="20"/>
+              </w:rPr>
+              <w:t>Tesis nueva detectada por el robot semanal. Revisa el texto completo en el SJF.</w:t>
+            </w:r>
+          </w:p>
+        </w:tc>
+      </w:tr>
+      <w:tr>
+        <w:tc>
+          <w:tcPr>
+            <w:tcW w:type="dxa" w:w="8787"/>
+            <w:tcBorders>
+              <w:top w:val="single" w:sz="4" w:color="D8D2C4"/>
+              <w:left w:val="single" w:sz="4" w:color="D8D2C4"/>
+              <w:bottom w:val="single" w:sz="4" w:color="D8D2C4"/>
+              <w:right w:val="single" w:sz="4" w:color="D8D2C4"/>
+            </w:tcBorders>
+          </w:tcPr>
+          <w:p>
+            <w:r>
+              <w:rPr>
+                <w:b/>
+                <w:color w:val="555555"/>
+                <w:sz w:val="18"/>
+              </w:rPr>
+              <w:t xml:space="preserve">Etiquetas: </w:t>
+            </w:r>
+            <w:r>
+              <w:rPr>
+                <w:color w:val="555555"/>
+                <w:sz w:val="18"/>
+              </w:rPr>
+              <w:t>#Juicio ejecutivo mercantil · #actualización automática</w:t>
+            </w:r>
+          </w:p>
+        </w:tc>
+      </w:tr>
+    </w:tbl>
+    <w:p/>
     <w:tbl>
       <w:tblPr>
         <w:tblW w:type="auto" w:w="0"/>

</xml_diff>

<commit_message>
Actualizacion semanal automatica 2026-06-06
</commit_message>
<xml_diff>
--- a/Acervo_Jurisprudencial.docx
+++ b/Acervo_Jurisprudencial.docx
@@ -627,7 +627,7 @@
           <w:color w:val="555555"/>
           <w:sz w:val="20"/>
         </w:rPr>
-        <w:t xml:space="preserve">  (5)</w:t>
+        <w:t xml:space="preserve">  (6)</w:t>
       </w:r>
     </w:p>
     <w:p>
@@ -640,6 +640,25 @@
           <w:sz w:val="20"/>
         </w:rPr>
         <w:t xml:space="preserve">      › Acto administrativo / nulidad</w:t>
+      </w:r>
+      <w:r>
+        <w:rPr>
+          <w:color w:val="555555"/>
+          <w:sz w:val="18"/>
+        </w:rPr>
+        <w:t xml:space="preserve">  [1]</w:t>
+      </w:r>
+    </w:p>
+    <w:p>
+      <w:pPr>
+        <w:ind w:left="794"/>
+      </w:pPr>
+      <w:r>
+        <w:rPr>
+          <w:color w:val="555555"/>
+          <w:sz w:val="20"/>
+        </w:rPr>
+        <w:t xml:space="preserve">      › Agua y servicios públicos</w:t>
       </w:r>
       <w:r>
         <w:rPr>
@@ -1235,7 +1254,7 @@
           <w:color w:val="555555"/>
           <w:sz w:val="20"/>
         </w:rPr>
-        <w:t xml:space="preserve">  (7)</w:t>
+        <w:t xml:space="preserve">  (8)</w:t>
       </w:r>
     </w:p>
     <w:p>
@@ -1274,6 +1293,25 @@
           <w:sz w:val="18"/>
         </w:rPr>
         <w:t xml:space="preserve">  [2]</w:t>
+      </w:r>
+    </w:p>
+    <w:p>
+      <w:pPr>
+        <w:ind w:left="794"/>
+      </w:pPr>
+      <w:r>
+        <w:rPr>
+          <w:color w:val="555555"/>
+          <w:sz w:val="20"/>
+        </w:rPr>
+        <w:t xml:space="preserve">      › Reparación del daño</w:t>
+      </w:r>
+      <w:r>
+        <w:rPr>
+          <w:color w:val="555555"/>
+          <w:sz w:val="18"/>
+        </w:rPr>
+        <w:t xml:space="preserve">  [1]</w:t>
       </w:r>
     </w:p>
     <w:p>
@@ -1447,7 +1485,7 @@
           <w:color w:val="555555"/>
           <w:sz w:val="20"/>
         </w:rPr>
-        <w:t xml:space="preserve">  (6)</w:t>
+        <w:t xml:space="preserve">  (7)</w:t>
       </w:r>
     </w:p>
     <w:p>
@@ -1504,7 +1542,7 @@
           <w:color w:val="555555"/>
           <w:sz w:val="18"/>
         </w:rPr>
-        <w:t xml:space="preserve">  [1]</w:t>
+        <w:t xml:space="preserve">  [2]</w:t>
       </w:r>
     </w:p>
     <w:p>
@@ -1580,7 +1618,7 @@
           <w:color w:val="555555"/>
           <w:sz w:val="20"/>
         </w:rPr>
-        <w:t xml:space="preserve">  (15)</w:t>
+        <w:t xml:space="preserve">  (16)</w:t>
       </w:r>
     </w:p>
     <w:p>
@@ -1599,7 +1637,7 @@
           <w:color w:val="555555"/>
           <w:sz w:val="18"/>
         </w:rPr>
-        <w:t xml:space="preserve">  [3]</w:t>
+        <w:t xml:space="preserve">  [4]</w:t>
       </w:r>
     </w:p>
     <w:p>
@@ -2089,7 +2127,7 @@
           <w:color w:val="555555"/>
           <w:sz w:val="22"/>
         </w:rPr>
-        <w:t>Total de entradas: 112</w:t>
+        <w:t>Total de entradas: 116</w:t>
       </w:r>
     </w:p>
     <w:p>
@@ -7862,6 +7900,280 @@
           <w:color w:val="1A1A1A"/>
           <w:sz w:val="24"/>
         </w:rPr>
+        <w:t>› Agua y servicios públicos</w:t>
+      </w:r>
+    </w:p>
+    <w:tbl>
+      <w:tblPr>
+        <w:tblW w:type="auto" w:w="0"/>
+        <w:jc w:val="center"/>
+        <w:tblLayout w:type="fixed"/>
+        <w:tblLook w:firstColumn="1" w:firstRow="1" w:lastColumn="0" w:lastRow="0" w:noHBand="0" w:noVBand="1" w:val="04A0"/>
+      </w:tblPr>
+      <w:tblGrid>
+        <w:gridCol w:w="8787"/>
+      </w:tblGrid>
+      <w:tr>
+        <w:tc>
+          <w:tcPr>
+            <w:tcW w:type="dxa" w:w="8787"/>
+            <w:shd w:val="clear" w:color="auto" w:fill="F0E6D5"/>
+            <w:tcBorders>
+              <w:top w:val="single" w:sz="4" w:color="D8D2C4"/>
+              <w:left w:val="single" w:sz="4" w:color="D8D2C4"/>
+              <w:bottom w:val="single" w:sz="4" w:color="D8D2C4"/>
+              <w:right w:val="single" w:sz="4" w:color="D8D2C4"/>
+            </w:tcBorders>
+          </w:tcPr>
+          <w:p>
+            <w:pPr>
+              <w:spacing w:after="40"/>
+            </w:pPr>
+            <w:r>
+              <w:rPr>
+                <w:b/>
+                <w:color w:val="6B1818"/>
+                <w:sz w:val="18"/>
+              </w:rPr>
+              <w:t xml:space="preserve">[JURISPRUDENCIA]  </w:t>
+            </w:r>
+            <w:r>
+              <w:rPr>
+                <w:color w:val="555555"/>
+                <w:sz w:val="18"/>
+              </w:rPr>
+              <w:t>Segunda Sala SCJN  ·  Duodécima Época  ·  Federal</w:t>
+            </w:r>
+          </w:p>
+        </w:tc>
+      </w:tr>
+      <w:tr>
+        <w:tc>
+          <w:tcPr>
+            <w:tcW w:type="dxa" w:w="8787"/>
+            <w:tcBorders>
+              <w:top w:val="single" w:sz="4" w:color="D8D2C4"/>
+              <w:left w:val="single" w:sz="4" w:color="D8D2C4"/>
+              <w:bottom w:val="single" w:sz="4" w:color="D8D2C4"/>
+              <w:right w:val="single" w:sz="4" w:color="D8D2C4"/>
+            </w:tcBorders>
+          </w:tcPr>
+          <w:p>
+            <w:pPr>
+              <w:jc w:val="both"/>
+            </w:pPr>
+            <w:r>
+              <w:rPr>
+                <w:b/>
+                <w:color w:val="6B1818"/>
+                <w:sz w:val="22"/>
+              </w:rPr>
+              <w:t xml:space="preserve">Rubro. </w:t>
+            </w:r>
+            <w:r>
+              <w:rPr>
+                <w:b/>
+                <w:sz w:val="22"/>
+              </w:rPr>
+              <w:t>CONCESIONES MINERAS. LOS ARTÍCULOS 15 DE LA LEY DE MINERÍA Y DÉCIMO TRANSITORIO, DEL DECRETO PUBLICADO EN EL DIARIO OFICIAL DE LA FEDERACIÓN EL 8 DE MAYO DE 2023, NO TRANSGREDEN EL DERECHO HUMANO A LA IGUALDAD.</w:t>
+            </w:r>
+          </w:p>
+        </w:tc>
+      </w:tr>
+      <w:tr>
+        <w:tc>
+          <w:tcPr>
+            <w:tcW w:type="dxa" w:w="8787"/>
+            <w:tcBorders>
+              <w:top w:val="single" w:sz="4" w:color="D8D2C4"/>
+              <w:left w:val="single" w:sz="4" w:color="D8D2C4"/>
+              <w:bottom w:val="single" w:sz="4" w:color="D8D2C4"/>
+              <w:right w:val="single" w:sz="4" w:color="D8D2C4"/>
+            </w:tcBorders>
+          </w:tcPr>
+          <w:p>
+            <w:r>
+              <w:rPr>
+                <w:i/>
+                <w:color w:val="555555"/>
+                <w:sz w:val="18"/>
+              </w:rPr>
+              <w:t>Subtema: Actualización automática semanal · Registro digital: 2032218 · Fecha: viernes 05 de junio de 2026 10:11 h · Fuente: Semanario Judicial de la Federación — captura automática · Vigencia: vigente</w:t>
+            </w:r>
+          </w:p>
+        </w:tc>
+      </w:tr>
+      <w:tr>
+        <w:tc>
+          <w:tcPr>
+            <w:tcW w:type="dxa" w:w="8787"/>
+            <w:tcBorders>
+              <w:top w:val="single" w:sz="4" w:color="D8D2C4"/>
+              <w:left w:val="single" w:sz="4" w:color="D8D2C4"/>
+              <w:bottom w:val="single" w:sz="4" w:color="D8D2C4"/>
+              <w:right w:val="single" w:sz="4" w:color="D8D2C4"/>
+            </w:tcBorders>
+          </w:tcPr>
+          <w:p>
+            <w:r>
+              <w:rPr>
+                <w:b/>
+                <w:color w:val="6B1818"/>
+                <w:sz w:val="18"/>
+              </w:rPr>
+              <w:t xml:space="preserve">Consulta SJF/SCJN: </w:t>
+            </w:r>
+            <w:r>
+              <w:rPr>
+                <w:color w:val="6B1818"/>
+                <w:sz w:val="18"/>
+                <w:u w:val="single"/>
+              </w:rPr>
+              <w:t>https://sjf2.scjn.gob.mx/detalle/tesis/2032218</w:t>
+            </w:r>
+          </w:p>
+        </w:tc>
+      </w:tr>
+      <w:tr>
+        <w:tc>
+          <w:tcPr>
+            <w:tcW w:type="dxa" w:w="8787"/>
+            <w:tcBorders>
+              <w:top w:val="single" w:sz="4" w:color="D8D2C4"/>
+              <w:left w:val="single" w:sz="4" w:color="D8D2C4"/>
+              <w:bottom w:val="single" w:sz="4" w:color="D8D2C4"/>
+              <w:right w:val="single" w:sz="4" w:color="D8D2C4"/>
+            </w:tcBorders>
+          </w:tcPr>
+          <w:p>
+            <w:pPr>
+              <w:jc w:val="both"/>
+            </w:pPr>
+            <w:r>
+              <w:rPr>
+                <w:b/>
+                <w:color w:val="6B1818"/>
+                <w:sz w:val="20"/>
+              </w:rPr>
+              <w:t xml:space="preserve">Texto. </w:t>
+            </w:r>
+            <w:r>
+              <w:rPr>
+                <w:sz w:val="20"/>
+              </w:rPr>
+              <w:t>Criterio publicado esta semana en el Semanario Judicial de la Federación. Ver texto íntegro en el SJF mediante el enlace directo.</w:t>
+            </w:r>
+          </w:p>
+        </w:tc>
+      </w:tr>
+      <w:tr>
+        <w:tc>
+          <w:tcPr>
+            <w:tcW w:type="dxa" w:w="8787"/>
+            <w:tcBorders>
+              <w:top w:val="single" w:sz="4" w:color="D8D2C4"/>
+              <w:left w:val="single" w:sz="4" w:color="D8D2C4"/>
+              <w:bottom w:val="single" w:sz="4" w:color="D8D2C4"/>
+              <w:right w:val="single" w:sz="4" w:color="D8D2C4"/>
+            </w:tcBorders>
+          </w:tcPr>
+          <w:p>
+            <w:pPr>
+              <w:jc w:val="both"/>
+            </w:pPr>
+            <w:r>
+              <w:rPr>
+                <w:b/>
+                <w:color w:val="6B1818"/>
+                <w:sz w:val="20"/>
+              </w:rPr>
+              <w:t xml:space="preserve">Trascendencia. </w:t>
+            </w:r>
+            <w:r>
+              <w:rPr>
+                <w:i/>
+                <w:sz w:val="20"/>
+              </w:rPr>
+              <w:t>Incorporada automáticamente en la actualización semanal. Pendiente de análisis editorial.</w:t>
+            </w:r>
+          </w:p>
+        </w:tc>
+      </w:tr>
+      <w:tr>
+        <w:tc>
+          <w:tcPr>
+            <w:tcW w:type="dxa" w:w="8787"/>
+            <w:tcBorders>
+              <w:top w:val="single" w:sz="4" w:color="D8D2C4"/>
+              <w:left w:val="single" w:sz="4" w:color="D8D2C4"/>
+              <w:bottom w:val="single" w:sz="4" w:color="D8D2C4"/>
+              <w:right w:val="single" w:sz="4" w:color="D8D2C4"/>
+            </w:tcBorders>
+          </w:tcPr>
+          <w:p>
+            <w:pPr>
+              <w:jc w:val="both"/>
+            </w:pPr>
+            <w:r>
+              <w:rPr>
+                <w:b/>
+                <w:color w:val="6B1818"/>
+                <w:sz w:val="20"/>
+              </w:rPr>
+              <w:t xml:space="preserve">Explicación práctica. </w:t>
+            </w:r>
+            <w:r>
+              <w:rPr>
+                <w:sz w:val="20"/>
+              </w:rPr>
+              <w:t>Tesis nueva detectada por el robot semanal. Revisa el texto completo en el SJF.</w:t>
+            </w:r>
+          </w:p>
+        </w:tc>
+      </w:tr>
+      <w:tr>
+        <w:tc>
+          <w:tcPr>
+            <w:tcW w:type="dxa" w:w="8787"/>
+            <w:tcBorders>
+              <w:top w:val="single" w:sz="4" w:color="D8D2C4"/>
+              <w:left w:val="single" w:sz="4" w:color="D8D2C4"/>
+              <w:bottom w:val="single" w:sz="4" w:color="D8D2C4"/>
+              <w:right w:val="single" w:sz="4" w:color="D8D2C4"/>
+            </w:tcBorders>
+          </w:tcPr>
+          <w:p>
+            <w:r>
+              <w:rPr>
+                <w:b/>
+                <w:color w:val="555555"/>
+                <w:sz w:val="18"/>
+              </w:rPr>
+              <w:t xml:space="preserve">Etiquetas: </w:t>
+            </w:r>
+            <w:r>
+              <w:rPr>
+                <w:color w:val="555555"/>
+                <w:sz w:val="18"/>
+              </w:rPr>
+              <w:t>#Agua y servicios públicos · #actualización automática</w:t>
+            </w:r>
+          </w:p>
+        </w:tc>
+      </w:tr>
+    </w:tbl>
+    <w:p/>
+    <w:p>
+      <w:pPr>
+        <w:ind w:left="170"/>
+      </w:pPr>
+      <w:r>
+        <w:rPr>
+          <w:b/>
+          <w:i/>
+          <w:color w:val="1A1A1A"/>
+          <w:sz w:val="24"/>
+        </w:rPr>
         <w:t>› Derecho a la salud — medicamentos</w:t>
       </w:r>
     </w:p>
@@ -18423,6 +18735,280 @@
                 <w:sz w:val="18"/>
               </w:rPr>
               <w:t>#prueba ilícita · #coimputado · #detención arbitraria · #árbol envenenado</w:t>
+            </w:r>
+          </w:p>
+        </w:tc>
+      </w:tr>
+    </w:tbl>
+    <w:p/>
+    <w:p>
+      <w:pPr>
+        <w:ind w:left="170"/>
+      </w:pPr>
+      <w:r>
+        <w:rPr>
+          <w:b/>
+          <w:i/>
+          <w:color w:val="1A1A1A"/>
+          <w:sz w:val="24"/>
+        </w:rPr>
+        <w:t>› Reparación del daño</w:t>
+      </w:r>
+    </w:p>
+    <w:tbl>
+      <w:tblPr>
+        <w:tblW w:type="auto" w:w="0"/>
+        <w:jc w:val="center"/>
+        <w:tblLayout w:type="fixed"/>
+        <w:tblLook w:firstColumn="1" w:firstRow="1" w:lastColumn="0" w:lastRow="0" w:noHBand="0" w:noVBand="1" w:val="04A0"/>
+      </w:tblPr>
+      <w:tblGrid>
+        <w:gridCol w:w="8787"/>
+      </w:tblGrid>
+      <w:tr>
+        <w:tc>
+          <w:tcPr>
+            <w:tcW w:type="dxa" w:w="8787"/>
+            <w:shd w:val="clear" w:color="auto" w:fill="F0E6D5"/>
+            <w:tcBorders>
+              <w:top w:val="single" w:sz="4" w:color="D8D2C4"/>
+              <w:left w:val="single" w:sz="4" w:color="D8D2C4"/>
+              <w:bottom w:val="single" w:sz="4" w:color="D8D2C4"/>
+              <w:right w:val="single" w:sz="4" w:color="D8D2C4"/>
+            </w:tcBorders>
+          </w:tcPr>
+          <w:p>
+            <w:pPr>
+              <w:spacing w:after="40"/>
+            </w:pPr>
+            <w:r>
+              <w:rPr>
+                <w:b/>
+                <w:color w:val="6B1818"/>
+                <w:sz w:val="18"/>
+              </w:rPr>
+              <w:t xml:space="preserve">[JURISPRUDENCIA]  </w:t>
+            </w:r>
+            <w:r>
+              <w:rPr>
+                <w:color w:val="555555"/>
+                <w:sz w:val="18"/>
+              </w:rPr>
+              <w:t>Segunda Sala SCJN  ·  Duodécima Época  ·  Federal</w:t>
+            </w:r>
+          </w:p>
+        </w:tc>
+      </w:tr>
+      <w:tr>
+        <w:tc>
+          <w:tcPr>
+            <w:tcW w:type="dxa" w:w="8787"/>
+            <w:tcBorders>
+              <w:top w:val="single" w:sz="4" w:color="D8D2C4"/>
+              <w:left w:val="single" w:sz="4" w:color="D8D2C4"/>
+              <w:bottom w:val="single" w:sz="4" w:color="D8D2C4"/>
+              <w:right w:val="single" w:sz="4" w:color="D8D2C4"/>
+            </w:tcBorders>
+          </w:tcPr>
+          <w:p>
+            <w:pPr>
+              <w:jc w:val="both"/>
+            </w:pPr>
+            <w:r>
+              <w:rPr>
+                <w:b/>
+                <w:color w:val="6B1818"/>
+                <w:sz w:val="22"/>
+              </w:rPr>
+              <w:t xml:space="preserve">Rubro. </w:t>
+            </w:r>
+            <w:r>
+              <w:rPr>
+                <w:b/>
+                <w:sz w:val="22"/>
+              </w:rPr>
+              <w:t>DAÑO MORAL. NO DEBE CONSIDERARSE LA SITUACIÓN ECONÓMICA DE LA VÍCTIMA PARA CUANTIFICAR SUS CONSECUENCIAS EXTRAPATRIMONIALES.</w:t>
+            </w:r>
+          </w:p>
+        </w:tc>
+      </w:tr>
+      <w:tr>
+        <w:tc>
+          <w:tcPr>
+            <w:tcW w:type="dxa" w:w="8787"/>
+            <w:tcBorders>
+              <w:top w:val="single" w:sz="4" w:color="D8D2C4"/>
+              <w:left w:val="single" w:sz="4" w:color="D8D2C4"/>
+              <w:bottom w:val="single" w:sz="4" w:color="D8D2C4"/>
+              <w:right w:val="single" w:sz="4" w:color="D8D2C4"/>
+            </w:tcBorders>
+          </w:tcPr>
+          <w:p>
+            <w:r>
+              <w:rPr>
+                <w:i/>
+                <w:color w:val="555555"/>
+                <w:sz w:val="18"/>
+              </w:rPr>
+              <w:t>Subtema: Actualización automática semanal · Registro digital: 2032225 · Fecha: viernes 05 de junio de 2026 10:11 h · Fuente: Semanario Judicial de la Federación — captura automática · Vigencia: vigente</w:t>
+            </w:r>
+          </w:p>
+        </w:tc>
+      </w:tr>
+      <w:tr>
+        <w:tc>
+          <w:tcPr>
+            <w:tcW w:type="dxa" w:w="8787"/>
+            <w:tcBorders>
+              <w:top w:val="single" w:sz="4" w:color="D8D2C4"/>
+              <w:left w:val="single" w:sz="4" w:color="D8D2C4"/>
+              <w:bottom w:val="single" w:sz="4" w:color="D8D2C4"/>
+              <w:right w:val="single" w:sz="4" w:color="D8D2C4"/>
+            </w:tcBorders>
+          </w:tcPr>
+          <w:p>
+            <w:r>
+              <w:rPr>
+                <w:b/>
+                <w:color w:val="6B1818"/>
+                <w:sz w:val="18"/>
+              </w:rPr>
+              <w:t xml:space="preserve">Consulta SJF/SCJN: </w:t>
+            </w:r>
+            <w:r>
+              <w:rPr>
+                <w:color w:val="6B1818"/>
+                <w:sz w:val="18"/>
+                <w:u w:val="single"/>
+              </w:rPr>
+              <w:t>https://sjf2.scjn.gob.mx/detalle/tesis/2032225</w:t>
+            </w:r>
+          </w:p>
+        </w:tc>
+      </w:tr>
+      <w:tr>
+        <w:tc>
+          <w:tcPr>
+            <w:tcW w:type="dxa" w:w="8787"/>
+            <w:tcBorders>
+              <w:top w:val="single" w:sz="4" w:color="D8D2C4"/>
+              <w:left w:val="single" w:sz="4" w:color="D8D2C4"/>
+              <w:bottom w:val="single" w:sz="4" w:color="D8D2C4"/>
+              <w:right w:val="single" w:sz="4" w:color="D8D2C4"/>
+            </w:tcBorders>
+          </w:tcPr>
+          <w:p>
+            <w:pPr>
+              <w:jc w:val="both"/>
+            </w:pPr>
+            <w:r>
+              <w:rPr>
+                <w:b/>
+                <w:color w:val="6B1818"/>
+                <w:sz w:val="20"/>
+              </w:rPr>
+              <w:t xml:space="preserve">Texto. </w:t>
+            </w:r>
+            <w:r>
+              <w:rPr>
+                <w:sz w:val="20"/>
+              </w:rPr>
+              <w:t>Criterio publicado esta semana en el Semanario Judicial de la Federación. Ver texto íntegro en el SJF mediante el enlace directo.</w:t>
+            </w:r>
+          </w:p>
+        </w:tc>
+      </w:tr>
+      <w:tr>
+        <w:tc>
+          <w:tcPr>
+            <w:tcW w:type="dxa" w:w="8787"/>
+            <w:tcBorders>
+              <w:top w:val="single" w:sz="4" w:color="D8D2C4"/>
+              <w:left w:val="single" w:sz="4" w:color="D8D2C4"/>
+              <w:bottom w:val="single" w:sz="4" w:color="D8D2C4"/>
+              <w:right w:val="single" w:sz="4" w:color="D8D2C4"/>
+            </w:tcBorders>
+          </w:tcPr>
+          <w:p>
+            <w:pPr>
+              <w:jc w:val="both"/>
+            </w:pPr>
+            <w:r>
+              <w:rPr>
+                <w:b/>
+                <w:color w:val="6B1818"/>
+                <w:sz w:val="20"/>
+              </w:rPr>
+              <w:t xml:space="preserve">Trascendencia. </w:t>
+            </w:r>
+            <w:r>
+              <w:rPr>
+                <w:i/>
+                <w:sz w:val="20"/>
+              </w:rPr>
+              <w:t>Incorporada automáticamente en la actualización semanal. Pendiente de análisis editorial.</w:t>
+            </w:r>
+          </w:p>
+        </w:tc>
+      </w:tr>
+      <w:tr>
+        <w:tc>
+          <w:tcPr>
+            <w:tcW w:type="dxa" w:w="8787"/>
+            <w:tcBorders>
+              <w:top w:val="single" w:sz="4" w:color="D8D2C4"/>
+              <w:left w:val="single" w:sz="4" w:color="D8D2C4"/>
+              <w:bottom w:val="single" w:sz="4" w:color="D8D2C4"/>
+              <w:right w:val="single" w:sz="4" w:color="D8D2C4"/>
+            </w:tcBorders>
+          </w:tcPr>
+          <w:p>
+            <w:pPr>
+              <w:jc w:val="both"/>
+            </w:pPr>
+            <w:r>
+              <w:rPr>
+                <w:b/>
+                <w:color w:val="6B1818"/>
+                <w:sz w:val="20"/>
+              </w:rPr>
+              <w:t xml:space="preserve">Explicación práctica. </w:t>
+            </w:r>
+            <w:r>
+              <w:rPr>
+                <w:sz w:val="20"/>
+              </w:rPr>
+              <w:t>Tesis nueva detectada por el robot semanal. Revisa el texto completo en el SJF.</w:t>
+            </w:r>
+          </w:p>
+        </w:tc>
+      </w:tr>
+      <w:tr>
+        <w:tc>
+          <w:tcPr>
+            <w:tcW w:type="dxa" w:w="8787"/>
+            <w:tcBorders>
+              <w:top w:val="single" w:sz="4" w:color="D8D2C4"/>
+              <w:left w:val="single" w:sz="4" w:color="D8D2C4"/>
+              <w:bottom w:val="single" w:sz="4" w:color="D8D2C4"/>
+              <w:right w:val="single" w:sz="4" w:color="D8D2C4"/>
+            </w:tcBorders>
+          </w:tcPr>
+          <w:p>
+            <w:r>
+              <w:rPr>
+                <w:b/>
+                <w:color w:val="555555"/>
+                <w:sz w:val="18"/>
+              </w:rPr>
+              <w:t xml:space="preserve">Etiquetas: </w:t>
+            </w:r>
+            <w:r>
+              <w:rPr>
+                <w:color w:val="555555"/>
+                <w:sz w:val="18"/>
+              </w:rPr>
+              <w:t>#Reparación del daño · #actualización automática</w:t>
             </w:r>
           </w:p>
         </w:tc>
@@ -21729,6 +22315,266 @@
       </w:tr>
     </w:tbl>
     <w:p/>
+    <w:tbl>
+      <w:tblPr>
+        <w:tblW w:type="auto" w:w="0"/>
+        <w:jc w:val="center"/>
+        <w:tblLayout w:type="fixed"/>
+        <w:tblLook w:firstColumn="1" w:firstRow="1" w:lastColumn="0" w:lastRow="0" w:noHBand="0" w:noVBand="1" w:val="04A0"/>
+      </w:tblPr>
+      <w:tblGrid>
+        <w:gridCol w:w="8787"/>
+      </w:tblGrid>
+      <w:tr>
+        <w:tc>
+          <w:tcPr>
+            <w:tcW w:type="dxa" w:w="8787"/>
+            <w:shd w:val="clear" w:color="auto" w:fill="F0E6D5"/>
+            <w:tcBorders>
+              <w:top w:val="single" w:sz="4" w:color="D8D2C4"/>
+              <w:left w:val="single" w:sz="4" w:color="D8D2C4"/>
+              <w:bottom w:val="single" w:sz="4" w:color="D8D2C4"/>
+              <w:right w:val="single" w:sz="4" w:color="D8D2C4"/>
+            </w:tcBorders>
+          </w:tcPr>
+          <w:p>
+            <w:pPr>
+              <w:spacing w:after="40"/>
+            </w:pPr>
+            <w:r>
+              <w:rPr>
+                <w:b/>
+                <w:color w:val="6B1818"/>
+                <w:sz w:val="18"/>
+              </w:rPr>
+              <w:t xml:space="preserve">[TESIS AISLADA]  </w:t>
+            </w:r>
+            <w:r>
+              <w:rPr>
+                <w:color w:val="555555"/>
+                <w:sz w:val="18"/>
+              </w:rPr>
+              <w:t>Tribunales Colegiados de Circuito  ·  Duodécima Época  ·  Federal</w:t>
+            </w:r>
+          </w:p>
+        </w:tc>
+      </w:tr>
+      <w:tr>
+        <w:tc>
+          <w:tcPr>
+            <w:tcW w:type="dxa" w:w="8787"/>
+            <w:tcBorders>
+              <w:top w:val="single" w:sz="4" w:color="D8D2C4"/>
+              <w:left w:val="single" w:sz="4" w:color="D8D2C4"/>
+              <w:bottom w:val="single" w:sz="4" w:color="D8D2C4"/>
+              <w:right w:val="single" w:sz="4" w:color="D8D2C4"/>
+            </w:tcBorders>
+          </w:tcPr>
+          <w:p>
+            <w:pPr>
+              <w:jc w:val="both"/>
+            </w:pPr>
+            <w:r>
+              <w:rPr>
+                <w:b/>
+                <w:color w:val="6B1818"/>
+                <w:sz w:val="22"/>
+              </w:rPr>
+              <w:t xml:space="preserve">Rubro. </w:t>
+            </w:r>
+            <w:r>
+              <w:rPr>
+                <w:b/>
+                <w:sz w:val="22"/>
+              </w:rPr>
+              <w:t>PROCEDIMIENTO DE SEPARACIÓN DEL CARGO PREVISTO EN LOS ARTÍCULOS 209 Y 210 DE LA LEY ORGÁNICA DEL PODER JUDICIAL DEL ESTADO DE PUEBLA (ABROGADA). AL NO PREVER LA FORMA COMO DEBE INICIARSE NI LOS TÉRMINOS DE SU SUSTANCIACIÓN, LE ES APLICABLE EL DE RESPONSABILIDAD ADMINISTRATIVA.</w:t>
+            </w:r>
+          </w:p>
+        </w:tc>
+      </w:tr>
+      <w:tr>
+        <w:tc>
+          <w:tcPr>
+            <w:tcW w:type="dxa" w:w="8787"/>
+            <w:tcBorders>
+              <w:top w:val="single" w:sz="4" w:color="D8D2C4"/>
+              <w:left w:val="single" w:sz="4" w:color="D8D2C4"/>
+              <w:bottom w:val="single" w:sz="4" w:color="D8D2C4"/>
+              <w:right w:val="single" w:sz="4" w:color="D8D2C4"/>
+            </w:tcBorders>
+          </w:tcPr>
+          <w:p>
+            <w:r>
+              <w:rPr>
+                <w:i/>
+                <w:color w:val="555555"/>
+                <w:sz w:val="18"/>
+              </w:rPr>
+              <w:t>Subtema: Actualización automática semanal · Registro digital: 2032233 · Fecha: viernes 05 de junio de 2026 10:11 · Fuente: Semanario Judicial de la Federación — captura automática · Vigencia: vigente</w:t>
+            </w:r>
+          </w:p>
+        </w:tc>
+      </w:tr>
+      <w:tr>
+        <w:tc>
+          <w:tcPr>
+            <w:tcW w:type="dxa" w:w="8787"/>
+            <w:tcBorders>
+              <w:top w:val="single" w:sz="4" w:color="D8D2C4"/>
+              <w:left w:val="single" w:sz="4" w:color="D8D2C4"/>
+              <w:bottom w:val="single" w:sz="4" w:color="D8D2C4"/>
+              <w:right w:val="single" w:sz="4" w:color="D8D2C4"/>
+            </w:tcBorders>
+          </w:tcPr>
+          <w:p>
+            <w:r>
+              <w:rPr>
+                <w:b/>
+                <w:color w:val="6B1818"/>
+                <w:sz w:val="18"/>
+              </w:rPr>
+              <w:t xml:space="preserve">Consulta SJF/SCJN: </w:t>
+            </w:r>
+            <w:r>
+              <w:rPr>
+                <w:color w:val="6B1818"/>
+                <w:sz w:val="18"/>
+                <w:u w:val="single"/>
+              </w:rPr>
+              <w:t>https://sjf2.scjn.gob.mx/detalle/tesis/2032233</w:t>
+            </w:r>
+          </w:p>
+        </w:tc>
+      </w:tr>
+      <w:tr>
+        <w:tc>
+          <w:tcPr>
+            <w:tcW w:type="dxa" w:w="8787"/>
+            <w:tcBorders>
+              <w:top w:val="single" w:sz="4" w:color="D8D2C4"/>
+              <w:left w:val="single" w:sz="4" w:color="D8D2C4"/>
+              <w:bottom w:val="single" w:sz="4" w:color="D8D2C4"/>
+              <w:right w:val="single" w:sz="4" w:color="D8D2C4"/>
+            </w:tcBorders>
+          </w:tcPr>
+          <w:p>
+            <w:pPr>
+              <w:jc w:val="both"/>
+            </w:pPr>
+            <w:r>
+              <w:rPr>
+                <w:b/>
+                <w:color w:val="6B1818"/>
+                <w:sz w:val="20"/>
+              </w:rPr>
+              <w:t xml:space="preserve">Texto. </w:t>
+            </w:r>
+            <w:r>
+              <w:rPr>
+                <w:sz w:val="20"/>
+              </w:rPr>
+              <w:t>Criterio publicado esta semana en el Semanario Judicial de la Federación. Ver texto íntegro en el SJF mediante el enlace directo.</w:t>
+            </w:r>
+          </w:p>
+        </w:tc>
+      </w:tr>
+      <w:tr>
+        <w:tc>
+          <w:tcPr>
+            <w:tcW w:type="dxa" w:w="8787"/>
+            <w:tcBorders>
+              <w:top w:val="single" w:sz="4" w:color="D8D2C4"/>
+              <w:left w:val="single" w:sz="4" w:color="D8D2C4"/>
+              <w:bottom w:val="single" w:sz="4" w:color="D8D2C4"/>
+              <w:right w:val="single" w:sz="4" w:color="D8D2C4"/>
+            </w:tcBorders>
+          </w:tcPr>
+          <w:p>
+            <w:pPr>
+              <w:jc w:val="both"/>
+            </w:pPr>
+            <w:r>
+              <w:rPr>
+                <w:b/>
+                <w:color w:val="6B1818"/>
+                <w:sz w:val="20"/>
+              </w:rPr>
+              <w:t xml:space="preserve">Trascendencia. </w:t>
+            </w:r>
+            <w:r>
+              <w:rPr>
+                <w:i/>
+                <w:sz w:val="20"/>
+              </w:rPr>
+              <w:t>Incorporada automáticamente en la actualización semanal. Pendiente de análisis editorial.</w:t>
+            </w:r>
+          </w:p>
+        </w:tc>
+      </w:tr>
+      <w:tr>
+        <w:tc>
+          <w:tcPr>
+            <w:tcW w:type="dxa" w:w="8787"/>
+            <w:tcBorders>
+              <w:top w:val="single" w:sz="4" w:color="D8D2C4"/>
+              <w:left w:val="single" w:sz="4" w:color="D8D2C4"/>
+              <w:bottom w:val="single" w:sz="4" w:color="D8D2C4"/>
+              <w:right w:val="single" w:sz="4" w:color="D8D2C4"/>
+            </w:tcBorders>
+          </w:tcPr>
+          <w:p>
+            <w:pPr>
+              <w:jc w:val="both"/>
+            </w:pPr>
+            <w:r>
+              <w:rPr>
+                <w:b/>
+                <w:color w:val="6B1818"/>
+                <w:sz w:val="20"/>
+              </w:rPr>
+              <w:t xml:space="preserve">Explicación práctica. </w:t>
+            </w:r>
+            <w:r>
+              <w:rPr>
+                <w:sz w:val="20"/>
+              </w:rPr>
+              <w:t>Tesis nueva detectada por el robot semanal. Revisa el texto completo en el SJF.</w:t>
+            </w:r>
+          </w:p>
+        </w:tc>
+      </w:tr>
+      <w:tr>
+        <w:tc>
+          <w:tcPr>
+            <w:tcW w:type="dxa" w:w="8787"/>
+            <w:tcBorders>
+              <w:top w:val="single" w:sz="4" w:color="D8D2C4"/>
+              <w:left w:val="single" w:sz="4" w:color="D8D2C4"/>
+              <w:bottom w:val="single" w:sz="4" w:color="D8D2C4"/>
+              <w:right w:val="single" w:sz="4" w:color="D8D2C4"/>
+            </w:tcBorders>
+          </w:tcPr>
+          <w:p>
+            <w:r>
+              <w:rPr>
+                <w:b/>
+                <w:color w:val="555555"/>
+                <w:sz w:val="18"/>
+              </w:rPr>
+              <w:t xml:space="preserve">Etiquetas: </w:t>
+            </w:r>
+            <w:r>
+              <w:rPr>
+                <w:color w:val="555555"/>
+                <w:sz w:val="18"/>
+              </w:rPr>
+              <w:t>#Responsabilidad administrativa de servidores públicos · #actualización automática</w:t>
+            </w:r>
+          </w:p>
+        </w:tc>
+      </w:tr>
+    </w:tbl>
+    <w:p/>
     <w:p>
       <w:r>
         <w:rPr>
@@ -22571,6 +23417,266 @@
         <w:t>› Arrendamiento</w:t>
       </w:r>
     </w:p>
+    <w:tbl>
+      <w:tblPr>
+        <w:tblW w:type="auto" w:w="0"/>
+        <w:jc w:val="center"/>
+        <w:tblLayout w:type="fixed"/>
+        <w:tblLook w:firstColumn="1" w:firstRow="1" w:lastColumn="0" w:lastRow="0" w:noHBand="0" w:noVBand="1" w:val="04A0"/>
+      </w:tblPr>
+      <w:tblGrid>
+        <w:gridCol w:w="8787"/>
+      </w:tblGrid>
+      <w:tr>
+        <w:tc>
+          <w:tcPr>
+            <w:tcW w:type="dxa" w:w="8787"/>
+            <w:shd w:val="clear" w:color="auto" w:fill="F0E6D5"/>
+            <w:tcBorders>
+              <w:top w:val="single" w:sz="4" w:color="D8D2C4"/>
+              <w:left w:val="single" w:sz="4" w:color="D8D2C4"/>
+              <w:bottom w:val="single" w:sz="4" w:color="D8D2C4"/>
+              <w:right w:val="single" w:sz="4" w:color="D8D2C4"/>
+            </w:tcBorders>
+          </w:tcPr>
+          <w:p>
+            <w:pPr>
+              <w:spacing w:after="40"/>
+            </w:pPr>
+            <w:r>
+              <w:rPr>
+                <w:b/>
+                <w:color w:val="6B1818"/>
+                <w:sz w:val="18"/>
+              </w:rPr>
+              <w:t xml:space="preserve">[TESIS AISLADA]  </w:t>
+            </w:r>
+            <w:r>
+              <w:rPr>
+                <w:color w:val="555555"/>
+                <w:sz w:val="18"/>
+              </w:rPr>
+              <w:t>Tribunales Colegiados de Circuito  ·  Duodécima Época  ·  Federal</w:t>
+            </w:r>
+          </w:p>
+        </w:tc>
+      </w:tr>
+      <w:tr>
+        <w:tc>
+          <w:tcPr>
+            <w:tcW w:type="dxa" w:w="8787"/>
+            <w:tcBorders>
+              <w:top w:val="single" w:sz="4" w:color="D8D2C4"/>
+              <w:left w:val="single" w:sz="4" w:color="D8D2C4"/>
+              <w:bottom w:val="single" w:sz="4" w:color="D8D2C4"/>
+              <w:right w:val="single" w:sz="4" w:color="D8D2C4"/>
+            </w:tcBorders>
+          </w:tcPr>
+          <w:p>
+            <w:pPr>
+              <w:jc w:val="both"/>
+            </w:pPr>
+            <w:r>
+              <w:rPr>
+                <w:b/>
+                <w:color w:val="6B1818"/>
+                <w:sz w:val="22"/>
+              </w:rPr>
+              <w:t xml:space="preserve">Rubro. </w:t>
+            </w:r>
+            <w:r>
+              <w:rPr>
+                <w:b/>
+                <w:sz w:val="22"/>
+              </w:rPr>
+              <w:t>PRESUNCIÓN DE PAGO EN ARRENDAMIENTO DE BIENES INMUEBLES. NO SE ACTUALIZA CUANDO EN EL CONTRATO SE PACTAN MODALIDADES ESPECÍFICAS DE PAGO Y EL ARRENDATARIO LAS VARÍA DE MANERA UNILATERAL.</w:t>
+            </w:r>
+          </w:p>
+        </w:tc>
+      </w:tr>
+      <w:tr>
+        <w:tc>
+          <w:tcPr>
+            <w:tcW w:type="dxa" w:w="8787"/>
+            <w:tcBorders>
+              <w:top w:val="single" w:sz="4" w:color="D8D2C4"/>
+              <w:left w:val="single" w:sz="4" w:color="D8D2C4"/>
+              <w:bottom w:val="single" w:sz="4" w:color="D8D2C4"/>
+              <w:right w:val="single" w:sz="4" w:color="D8D2C4"/>
+            </w:tcBorders>
+          </w:tcPr>
+          <w:p>
+            <w:r>
+              <w:rPr>
+                <w:i/>
+                <w:color w:val="555555"/>
+                <w:sz w:val="18"/>
+              </w:rPr>
+              <w:t>Subtema: Actualización automática semanal · Registro digital: 2032235 · Fecha: viernes 05 de junio de 2026 10:11 h · Fuente: Semanario Judicial de la Federación — captura automática · Vigencia: vigente</w:t>
+            </w:r>
+          </w:p>
+        </w:tc>
+      </w:tr>
+      <w:tr>
+        <w:tc>
+          <w:tcPr>
+            <w:tcW w:type="dxa" w:w="8787"/>
+            <w:tcBorders>
+              <w:top w:val="single" w:sz="4" w:color="D8D2C4"/>
+              <w:left w:val="single" w:sz="4" w:color="D8D2C4"/>
+              <w:bottom w:val="single" w:sz="4" w:color="D8D2C4"/>
+              <w:right w:val="single" w:sz="4" w:color="D8D2C4"/>
+            </w:tcBorders>
+          </w:tcPr>
+          <w:p>
+            <w:r>
+              <w:rPr>
+                <w:b/>
+                <w:color w:val="6B1818"/>
+                <w:sz w:val="18"/>
+              </w:rPr>
+              <w:t xml:space="preserve">Consulta SJF/SCJN: </w:t>
+            </w:r>
+            <w:r>
+              <w:rPr>
+                <w:color w:val="6B1818"/>
+                <w:sz w:val="18"/>
+                <w:u w:val="single"/>
+              </w:rPr>
+              <w:t>https://sjf2.scjn.gob.mx/detalle/tesis/2032235</w:t>
+            </w:r>
+          </w:p>
+        </w:tc>
+      </w:tr>
+      <w:tr>
+        <w:tc>
+          <w:tcPr>
+            <w:tcW w:type="dxa" w:w="8787"/>
+            <w:tcBorders>
+              <w:top w:val="single" w:sz="4" w:color="D8D2C4"/>
+              <w:left w:val="single" w:sz="4" w:color="D8D2C4"/>
+              <w:bottom w:val="single" w:sz="4" w:color="D8D2C4"/>
+              <w:right w:val="single" w:sz="4" w:color="D8D2C4"/>
+            </w:tcBorders>
+          </w:tcPr>
+          <w:p>
+            <w:pPr>
+              <w:jc w:val="both"/>
+            </w:pPr>
+            <w:r>
+              <w:rPr>
+                <w:b/>
+                <w:color w:val="6B1818"/>
+                <w:sz w:val="20"/>
+              </w:rPr>
+              <w:t xml:space="preserve">Texto. </w:t>
+            </w:r>
+            <w:r>
+              <w:rPr>
+                <w:sz w:val="20"/>
+              </w:rPr>
+              <w:t>Criterio publicado esta semana en el Semanario Judicial de la Federación. Ver texto íntegro en el SJF mediante el enlace directo.</w:t>
+            </w:r>
+          </w:p>
+        </w:tc>
+      </w:tr>
+      <w:tr>
+        <w:tc>
+          <w:tcPr>
+            <w:tcW w:type="dxa" w:w="8787"/>
+            <w:tcBorders>
+              <w:top w:val="single" w:sz="4" w:color="D8D2C4"/>
+              <w:left w:val="single" w:sz="4" w:color="D8D2C4"/>
+              <w:bottom w:val="single" w:sz="4" w:color="D8D2C4"/>
+              <w:right w:val="single" w:sz="4" w:color="D8D2C4"/>
+            </w:tcBorders>
+          </w:tcPr>
+          <w:p>
+            <w:pPr>
+              <w:jc w:val="both"/>
+            </w:pPr>
+            <w:r>
+              <w:rPr>
+                <w:b/>
+                <w:color w:val="6B1818"/>
+                <w:sz w:val="20"/>
+              </w:rPr>
+              <w:t xml:space="preserve">Trascendencia. </w:t>
+            </w:r>
+            <w:r>
+              <w:rPr>
+                <w:i/>
+                <w:sz w:val="20"/>
+              </w:rPr>
+              <w:t>Incorporada automáticamente en la actualización semanal. Pendiente de análisis editorial.</w:t>
+            </w:r>
+          </w:p>
+        </w:tc>
+      </w:tr>
+      <w:tr>
+        <w:tc>
+          <w:tcPr>
+            <w:tcW w:type="dxa" w:w="8787"/>
+            <w:tcBorders>
+              <w:top w:val="single" w:sz="4" w:color="D8D2C4"/>
+              <w:left w:val="single" w:sz="4" w:color="D8D2C4"/>
+              <w:bottom w:val="single" w:sz="4" w:color="D8D2C4"/>
+              <w:right w:val="single" w:sz="4" w:color="D8D2C4"/>
+            </w:tcBorders>
+          </w:tcPr>
+          <w:p>
+            <w:pPr>
+              <w:jc w:val="both"/>
+            </w:pPr>
+            <w:r>
+              <w:rPr>
+                <w:b/>
+                <w:color w:val="6B1818"/>
+                <w:sz w:val="20"/>
+              </w:rPr>
+              <w:t xml:space="preserve">Explicación práctica. </w:t>
+            </w:r>
+            <w:r>
+              <w:rPr>
+                <w:sz w:val="20"/>
+              </w:rPr>
+              <w:t>Tesis nueva detectada por el robot semanal. Revisa el texto completo en el SJF.</w:t>
+            </w:r>
+          </w:p>
+        </w:tc>
+      </w:tr>
+      <w:tr>
+        <w:tc>
+          <w:tcPr>
+            <w:tcW w:type="dxa" w:w="8787"/>
+            <w:tcBorders>
+              <w:top w:val="single" w:sz="4" w:color="D8D2C4"/>
+              <w:left w:val="single" w:sz="4" w:color="D8D2C4"/>
+              <w:bottom w:val="single" w:sz="4" w:color="D8D2C4"/>
+              <w:right w:val="single" w:sz="4" w:color="D8D2C4"/>
+            </w:tcBorders>
+          </w:tcPr>
+          <w:p>
+            <w:r>
+              <w:rPr>
+                <w:b/>
+                <w:color w:val="555555"/>
+                <w:sz w:val="18"/>
+              </w:rPr>
+              <w:t xml:space="preserve">Etiquetas: </w:t>
+            </w:r>
+            <w:r>
+              <w:rPr>
+                <w:color w:val="555555"/>
+                <w:sz w:val="18"/>
+              </w:rPr>
+              <w:t>#Arrendamiento · #actualización automática</w:t>
+            </w:r>
+          </w:p>
+        </w:tc>
+      </w:tr>
+    </w:tbl>
+    <w:p/>
     <w:tbl>
       <w:tblPr>
         <w:tblW w:type="auto" w:w="0"/>

</xml_diff>